<commit_message>
Chapter 1: rewrite prose in a more natural author voice
Fewer dash-and-'not X but Y' constructions, varied sentence rhythm, first-person
author voice, emoji removed from box headings. Content and formatting unchanged.

Co-Authored-By: Claude Opus 5.5 <noreply@anthropic.com>
Claude-Session: https://claude.ai/code/session_01LhGpaEd3xGUonrLS6HmYox
</commit_message>
<xml_diff>
--- a/chapters/الفصل_الأول_النهائي.docx
+++ b/chapters/الفصل_الأول_النهائي.docx
@@ -205,223 +205,7 @@
                 <w:szCs w:val="28"/>
                 <w:rtl/>
               </w:rPr>
-              <w:t>🏢</w:t>
-            </w:r>
-            <w:r>
-              <w:rPr>
-                <w:rFonts w:ascii="Sakkal Majalla" w:hAnsi="Sakkal Majalla" w:cs="Sakkal Majalla"/>
-                <w:b/>
-                <w:bCs/>
-                <w:color w:val="FFFFFF"/>
-                <w:sz w:val="28"/>
-                <w:szCs w:val="28"/>
-                <w:rtl/>
-              </w:rPr>
-              <w:t xml:space="preserve">  </w:t>
-            </w:r>
-            <w:r>
-              <w:rPr>
-                <w:rFonts w:ascii="Sakkal Majalla" w:hAnsi="Sakkal Majalla" w:cs="Sakkal Majalla" w:hint="cs"/>
-                <w:b/>
-                <w:bCs/>
-                <w:color w:val="FFFFFF"/>
-                <w:sz w:val="28"/>
-                <w:szCs w:val="28"/>
-                <w:rtl/>
-              </w:rPr>
-              <w:t>ثلاثة</w:t>
-            </w:r>
-            <w:r>
-              <w:rPr>
-                <w:rFonts w:ascii="Sakkal Majalla" w:hAnsi="Sakkal Majalla" w:cs="Sakkal Majalla"/>
-                <w:b/>
-                <w:bCs/>
-                <w:color w:val="FFFFFF"/>
-                <w:sz w:val="28"/>
-                <w:szCs w:val="28"/>
-                <w:rtl/>
-              </w:rPr>
-              <w:t xml:space="preserve"> </w:t>
-            </w:r>
-            <w:r>
-              <w:rPr>
-                <w:rFonts w:ascii="Sakkal Majalla" w:hAnsi="Sakkal Majalla" w:cs="Sakkal Majalla" w:hint="cs"/>
-                <w:b/>
-                <w:bCs/>
-                <w:color w:val="FFFFFF"/>
-                <w:sz w:val="28"/>
-                <w:szCs w:val="28"/>
-                <w:rtl/>
-              </w:rPr>
-              <w:t>مديرين،</w:t>
-            </w:r>
-            <w:r>
-              <w:rPr>
-                <w:rFonts w:ascii="Sakkal Majalla" w:hAnsi="Sakkal Majalla" w:cs="Sakkal Majalla"/>
-                <w:b/>
-                <w:bCs/>
-                <w:color w:val="FFFFFF"/>
-                <w:sz w:val="28"/>
-                <w:szCs w:val="28"/>
-                <w:rtl/>
-              </w:rPr>
-              <w:t xml:space="preserve"> </w:t>
-            </w:r>
-            <w:r>
-              <w:rPr>
-                <w:rFonts w:ascii="Sakkal Majalla" w:hAnsi="Sakkal Majalla" w:cs="Sakkal Majalla" w:hint="cs"/>
-                <w:b/>
-                <w:bCs/>
-                <w:color w:val="FFFFFF"/>
-                <w:sz w:val="28"/>
-                <w:szCs w:val="28"/>
-                <w:rtl/>
-              </w:rPr>
-              <w:t>مشكلة</w:t>
-            </w:r>
-            <w:r>
-              <w:rPr>
-                <w:rFonts w:ascii="Sakkal Majalla" w:hAnsi="Sakkal Majalla" w:cs="Sakkal Majalla"/>
-                <w:b/>
-                <w:bCs/>
-                <w:color w:val="FFFFFF"/>
-                <w:sz w:val="28"/>
-                <w:szCs w:val="28"/>
-                <w:rtl/>
-              </w:rPr>
-              <w:t xml:space="preserve"> </w:t>
-            </w:r>
-            <w:r>
-              <w:rPr>
-                <w:rFonts w:ascii="Sakkal Majalla" w:hAnsi="Sakkal Majalla" w:cs="Sakkal Majalla" w:hint="cs"/>
-                <w:b/>
-                <w:bCs/>
-                <w:color w:val="FFFFFF"/>
-                <w:sz w:val="28"/>
-                <w:szCs w:val="28"/>
-                <w:rtl/>
-              </w:rPr>
-              <w:t>واحدة</w:t>
-            </w:r>
-            <w:r>
-              <w:rPr>
-                <w:rFonts w:ascii="Sakkal Majalla" w:hAnsi="Sakkal Majalla" w:cs="Sakkal Majalla"/>
-                <w:b/>
-                <w:bCs/>
-                <w:color w:val="FFFFFF"/>
-                <w:sz w:val="28"/>
-                <w:szCs w:val="28"/>
-                <w:rtl/>
-              </w:rPr>
-              <w:t xml:space="preserve"> </w:t>
-            </w:r>
-            <w:r>
-              <w:rPr>
-                <w:rFonts w:ascii="Sakkal Majalla" w:hAnsi="Sakkal Majalla" w:cs="Sakkal Majalla" w:hint="cs"/>
-                <w:b/>
-                <w:bCs/>
-                <w:color w:val="FFFFFF"/>
-                <w:sz w:val="28"/>
-                <w:szCs w:val="28"/>
-                <w:rtl/>
-              </w:rPr>
-              <w:t>—</w:t>
-            </w:r>
-            <w:r>
-              <w:rPr>
-                <w:rFonts w:ascii="Sakkal Majalla" w:hAnsi="Sakkal Majalla" w:cs="Sakkal Majalla"/>
-                <w:b/>
-                <w:bCs/>
-                <w:color w:val="FFFFFF"/>
-                <w:sz w:val="28"/>
-                <w:szCs w:val="28"/>
-                <w:rtl/>
-              </w:rPr>
-              <w:t xml:space="preserve"> </w:t>
-            </w:r>
-            <w:r>
-              <w:rPr>
-                <w:rFonts w:ascii="Sakkal Majalla" w:hAnsi="Sakkal Majalla" w:cs="Sakkal Majalla" w:hint="cs"/>
-                <w:b/>
-                <w:bCs/>
-                <w:color w:val="FFFFFF"/>
-                <w:sz w:val="28"/>
-                <w:szCs w:val="28"/>
-                <w:rtl/>
-              </w:rPr>
-              <w:t>أيهم</w:t>
-            </w:r>
-            <w:r>
-              <w:rPr>
-                <w:rFonts w:ascii="Sakkal Majalla" w:hAnsi="Sakkal Majalla" w:cs="Sakkal Majalla"/>
-                <w:b/>
-                <w:bCs/>
-                <w:color w:val="FFFFFF"/>
-                <w:sz w:val="28"/>
-                <w:szCs w:val="28"/>
-                <w:rtl/>
-              </w:rPr>
-              <w:t xml:space="preserve"> </w:t>
-            </w:r>
-            <w:r>
-              <w:rPr>
-                <w:rFonts w:ascii="Sakkal Majalla" w:hAnsi="Sakkal Majalla" w:cs="Sakkal Majalla" w:hint="cs"/>
-                <w:b/>
-                <w:bCs/>
-                <w:color w:val="FFFFFF"/>
-                <w:sz w:val="28"/>
-                <w:szCs w:val="28"/>
-                <w:rtl/>
-              </w:rPr>
-              <w:t>يسأل</w:t>
-            </w:r>
-            <w:r>
-              <w:rPr>
-                <w:rFonts w:ascii="Sakkal Majalla" w:hAnsi="Sakkal Majalla" w:cs="Sakkal Majalla"/>
-                <w:b/>
-                <w:bCs/>
-                <w:color w:val="FFFFFF"/>
-                <w:sz w:val="28"/>
-                <w:szCs w:val="28"/>
-                <w:rtl/>
-              </w:rPr>
-              <w:t xml:space="preserve"> </w:t>
-            </w:r>
-            <w:r>
-              <w:rPr>
-                <w:rFonts w:ascii="Sakkal Majalla" w:hAnsi="Sakkal Majalla" w:cs="Sakkal Majalla" w:hint="cs"/>
-                <w:b/>
-                <w:bCs/>
-                <w:color w:val="FFFFFF"/>
-                <w:sz w:val="28"/>
-                <w:szCs w:val="28"/>
-                <w:rtl/>
-              </w:rPr>
-              <w:t>السؤال</w:t>
-            </w:r>
-            <w:r>
-              <w:rPr>
-                <w:rFonts w:ascii="Sakkal Majalla" w:hAnsi="Sakkal Majalla" w:cs="Sakkal Majalla"/>
-                <w:b/>
-                <w:bCs/>
-                <w:color w:val="FFFFFF"/>
-                <w:sz w:val="28"/>
-                <w:szCs w:val="28"/>
-                <w:rtl/>
-              </w:rPr>
-              <w:t xml:space="preserve"> </w:t>
-            </w:r>
-            <w:r>
-              <w:rPr>
-                <w:rFonts w:ascii="Sakkal Majalla" w:hAnsi="Sakkal Majalla" w:cs="Sakkal Majalla" w:hint="cs"/>
-                <w:b/>
-                <w:bCs/>
-                <w:color w:val="FFFFFF"/>
-                <w:sz w:val="28"/>
-                <w:szCs w:val="28"/>
-                <w:rtl/>
-              </w:rPr>
-              <w:t>الصحيح؟</w:t>
+              <w:t xml:space="preserve">ثلاثة مديرين ونظام تقييم واحد</w:t>
             </w:r>
           </w:p>
         </w:tc>
@@ -460,7 +244,7 @@
                 <w:szCs w:val="28"/>
                 <w:rtl/>
               </w:rPr>
-              <w:t xml:space="preserve">مثال توضيحي: كُلِّف ثلاثة مديرين في شركة صناعية بتصميم نظام تقييم أداء جديد للشركة.  المدير الأول توجَّه مباشرةً إلى Google وكتب: "Islamic performance evaluation system". وجد نظاماً غربياً من KPIs محكمة التصميم مع استشهادات قرآنية في الرأس وهوامش تحتوي على أحاديث. تبنَّاه بارتياح — فهو يجمع "أفضل العالمين".  المدير الثاني فتح المصحف وبحث عن آيات "المحاسبة" و"المسؤولية" وأضافها كمقدمات دينية لنفس النظام الغربي. قال لنفسه: "على الأقل أنا انطلقتُ من القرآن."  المدير الثالث طلب تأجيل التصميم يومًا، ووقف أمام ورقة بيضاء وسأل: "ما الذي يقوله القرآن عن الإنسان الذي سأُقيِّمه؟" وقد يصل في نهاية رحلة شاقة إلى هندسة مختلفة — تقييم يبدأ بسؤال الاستخلاف لا الكفاءة وحدها، ويَقيس الأمانة لا الإنتاجية فقط، ويُعامل المُقيَّم مُكلَّفاً بالوسع لا موظفاً يُثاب على النتائج وحدها.  </w:t>
+              <w:t xml:space="preserve">مثال توضيحي. طُلب من ثلاثة مديرين في شركة صناعية أن يصمّموا نظامًا جديدًا لتقييم الأداء. بدأ الأول بمحرّك البحث، فكتب: "Islamic performance evaluation system"، فوجد نظامًا غربيًا محكمًا من مؤشرات الأداء، في رأسه آيات وفي هوامشه أحاديث، فاعتمده مطمئنًا إلى أنه جمع خير الطرفين. وفتح الثاني المصحف، فجمع آيات المحاسبة والمسؤولية ووضعها مقدمةً للنظام الغربي نفسه، وقال لنفسه: على الأقل بدأتُ من القرآن. أما الثالث فطلب يومًا إضافيًا، وجلس أمام ورقة بيضاء يسأل: ما الذي يقوله القرآن عن الإنسان الذي سأقيّمه؟ قد تنتهي به هذه الرحلة الشاقة إلى تصميم مختلف: تقييم يسأل عن الاستخلاف قبل الكفاءة، ويَقيس الأمانة إلى جانب الإنتاجية، ويعامل الموظف مكلَّفًا بقدر وسعه، لا آلةً تُكافأ على النتائج وحدها.  </w:t>
             </w:r>
             <w:r>
               <w:rPr>
@@ -480,7 +264,7 @@
                 <w:szCs w:val="28"/>
                 <w:rtl/>
               </w:rPr>
-              <w:t xml:space="preserve"> ما الفارق بين المديرين الثلاثة؟ ليس في النية ولا في الورع — بل في نقطة الانطلاق. والمثال لا يُثبت أن المدير الثالث على صواب؛ إنما يُحدِّد موضع السؤال الذي ينطلق منه هذا الكتاب: هل يتغيَّر النظام الإداري حين تتغيَّر نقطة انطلاقه، أم أننا نُعيد تسمية الأداة نفسها بألفاظ دينية؟</w:t>
+              <w:t xml:space="preserve"> لم يكن الفرق بينهم في النية ولا في التديّن، وإنما في المكان الذي بدأ منه كلٌّ منهم. ولا أسوق المثال لأثبت أن الثالث على صواب؛ أسوقه لأضع يدي على السؤال الذي يدور حوله هذا الكتاب: هل يتغيّر النظام الإداري فعلًا حين تتغيّر نقطة انطلاقه، أم أننا نعيد تسمية الأداة نفسها بألفاظ دينية؟</w:t>
             </w:r>
           </w:p>
         </w:tc>
@@ -558,79 +342,7 @@
                 <w:szCs w:val="28"/>
                 <w:rtl/>
               </w:rPr>
-              <w:t>📋</w:t>
-            </w:r>
-            <w:r>
-              <w:rPr>
-                <w:rFonts w:ascii="Sakkal Majalla" w:hAnsi="Sakkal Majalla" w:cs="Sakkal Majalla"/>
-                <w:b/>
-                <w:bCs/>
-                <w:color w:val="FFFFFF"/>
-                <w:sz w:val="28"/>
-                <w:szCs w:val="28"/>
-                <w:rtl/>
-              </w:rPr>
-              <w:t xml:space="preserve">  </w:t>
-            </w:r>
-            <w:r>
-              <w:rPr>
-                <w:rFonts w:ascii="Sakkal Majalla" w:hAnsi="Sakkal Majalla" w:cs="Sakkal Majalla" w:hint="cs"/>
-                <w:b/>
-                <w:bCs/>
-                <w:color w:val="FFFFFF"/>
-                <w:sz w:val="28"/>
-                <w:szCs w:val="28"/>
-                <w:rtl/>
-              </w:rPr>
-              <w:t>في</w:t>
-            </w:r>
-            <w:r>
-              <w:rPr>
-                <w:rFonts w:ascii="Sakkal Majalla" w:hAnsi="Sakkal Majalla" w:cs="Sakkal Majalla"/>
-                <w:b/>
-                <w:bCs/>
-                <w:color w:val="FFFFFF"/>
-                <w:sz w:val="28"/>
-                <w:szCs w:val="28"/>
-                <w:rtl/>
-              </w:rPr>
-              <w:t xml:space="preserve"> </w:t>
-            </w:r>
-            <w:r>
-              <w:rPr>
-                <w:rFonts w:ascii="Sakkal Majalla" w:hAnsi="Sakkal Majalla" w:cs="Sakkal Majalla" w:hint="cs"/>
-                <w:b/>
-                <w:bCs/>
-                <w:color w:val="FFFFFF"/>
-                <w:sz w:val="28"/>
-                <w:szCs w:val="28"/>
-                <w:rtl/>
-              </w:rPr>
-              <w:t>هذا</w:t>
-            </w:r>
-            <w:r>
-              <w:rPr>
-                <w:rFonts w:ascii="Sakkal Majalla" w:hAnsi="Sakkal Majalla" w:cs="Sakkal Majalla"/>
-                <w:b/>
-                <w:bCs/>
-                <w:color w:val="FFFFFF"/>
-                <w:sz w:val="28"/>
-                <w:szCs w:val="28"/>
-                <w:rtl/>
-              </w:rPr>
-              <w:t xml:space="preserve"> </w:t>
-            </w:r>
-            <w:r>
-              <w:rPr>
-                <w:rFonts w:ascii="Sakkal Majalla" w:hAnsi="Sakkal Majalla" w:cs="Sakkal Majalla" w:hint="cs"/>
-                <w:b/>
-                <w:bCs/>
-                <w:color w:val="FFFFFF"/>
-                <w:sz w:val="28"/>
-                <w:szCs w:val="28"/>
-                <w:rtl/>
-              </w:rPr>
-              <w:t>الفصل</w:t>
+              <w:t xml:space="preserve">في هذا الفصل</w:t>
             </w:r>
           </w:p>
         </w:tc>
@@ -669,227 +381,7 @@
                 <w:szCs w:val="28"/>
                 <w:rtl/>
               </w:rPr>
-              <w:t xml:space="preserve">• السؤال الجوهري: ما الفارق البنيوي بين "أين الإدارة في القرآن؟" و"ما الذي ينبثق من القرآن؟"  • الإجابة في 3 أسطر: الفصل يُعلن إطاراً معرفياً مُحدَّداً، ويُرسِّخ مبدأ أقومية القرآن بمعنييه، ويُشخِّص ظاهرة القولبة بوصفها العائق الرئيسي للمعرفة الإسلامية الأصيلة.  • الأداة التي ستكتسبها: جدول المسارين (القرآن </w:t>
-            </w:r>
-            <w:r>
-              <w:rPr>
-                <w:rFonts w:hint="cs"/>
-                <w:color w:val="000000"/>
-                <w:sz w:val="28"/>
-                <w:szCs w:val="28"/>
-                <w:rtl/>
-              </w:rPr>
-              <w:t>←</w:t>
-            </w:r>
-            <w:r>
-              <w:rPr>
-                <w:rFonts w:ascii="Sakkal Majalla" w:hAnsi="Sakkal Majalla" w:cs="Sakkal Majalla"/>
-                <w:color w:val="000000"/>
-                <w:sz w:val="28"/>
-                <w:szCs w:val="28"/>
-                <w:rtl/>
-              </w:rPr>
-              <w:t xml:space="preserve"> </w:t>
-            </w:r>
-            <w:r>
-              <w:rPr>
-                <w:rFonts w:ascii="Sakkal Majalla" w:hAnsi="Sakkal Majalla" w:cs="Sakkal Majalla" w:hint="cs"/>
-                <w:color w:val="000000"/>
-                <w:sz w:val="28"/>
-                <w:szCs w:val="28"/>
-                <w:rtl/>
-              </w:rPr>
-              <w:t>الإدارة</w:t>
-            </w:r>
-            <w:r>
-              <w:rPr>
-                <w:rFonts w:ascii="Sakkal Majalla" w:hAnsi="Sakkal Majalla" w:cs="Sakkal Majalla"/>
-                <w:color w:val="000000"/>
-                <w:sz w:val="28"/>
-                <w:szCs w:val="28"/>
-                <w:rtl/>
-              </w:rPr>
-              <w:t xml:space="preserve"> </w:t>
-            </w:r>
-            <w:r>
-              <w:rPr>
-                <w:rFonts w:ascii="Sakkal Majalla" w:hAnsi="Sakkal Majalla" w:cs="Sakkal Majalla" w:hint="cs"/>
-                <w:color w:val="000000"/>
-                <w:sz w:val="28"/>
-                <w:szCs w:val="28"/>
-                <w:rtl/>
-              </w:rPr>
-              <w:t>مقابل</w:t>
-            </w:r>
-            <w:r>
-              <w:rPr>
-                <w:rFonts w:ascii="Sakkal Majalla" w:hAnsi="Sakkal Majalla" w:cs="Sakkal Majalla"/>
-                <w:color w:val="000000"/>
-                <w:sz w:val="28"/>
-                <w:szCs w:val="28"/>
-                <w:rtl/>
-              </w:rPr>
-              <w:t xml:space="preserve"> </w:t>
-            </w:r>
-            <w:r>
-              <w:rPr>
-                <w:rFonts w:ascii="Sakkal Majalla" w:hAnsi="Sakkal Majalla" w:cs="Sakkal Majalla" w:hint="cs"/>
-                <w:color w:val="000000"/>
-                <w:sz w:val="28"/>
-                <w:szCs w:val="28"/>
-                <w:rtl/>
-              </w:rPr>
-              <w:t>الإدارة</w:t>
-            </w:r>
-            <w:r>
-              <w:rPr>
-                <w:rFonts w:ascii="Sakkal Majalla" w:hAnsi="Sakkal Majalla" w:cs="Sakkal Majalla"/>
-                <w:color w:val="000000"/>
-                <w:sz w:val="28"/>
-                <w:szCs w:val="28"/>
-                <w:rtl/>
-              </w:rPr>
-              <w:t xml:space="preserve"> </w:t>
-            </w:r>
-            <w:r>
-              <w:rPr>
-                <w:rFonts w:hint="cs"/>
-                <w:color w:val="000000"/>
-                <w:sz w:val="28"/>
-                <w:szCs w:val="28"/>
-                <w:rtl/>
-              </w:rPr>
-              <w:t>←</w:t>
-            </w:r>
-            <w:r>
-              <w:rPr>
-                <w:rFonts w:ascii="Sakkal Majalla" w:hAnsi="Sakkal Majalla" w:cs="Sakkal Majalla"/>
-                <w:color w:val="000000"/>
-                <w:sz w:val="28"/>
-                <w:szCs w:val="28"/>
-                <w:rtl/>
-              </w:rPr>
-              <w:t xml:space="preserve"> </w:t>
-            </w:r>
-            <w:r>
-              <w:rPr>
-                <w:rFonts w:ascii="Sakkal Majalla" w:hAnsi="Sakkal Majalla" w:cs="Sakkal Majalla" w:hint="cs"/>
-                <w:color w:val="000000"/>
-                <w:sz w:val="28"/>
-                <w:szCs w:val="28"/>
-                <w:rtl/>
-              </w:rPr>
-              <w:t>القرآن</w:t>
-            </w:r>
-            <w:r>
-              <w:rPr>
-                <w:rFonts w:ascii="Sakkal Majalla" w:hAnsi="Sakkal Majalla" w:cs="Sakkal Majalla"/>
-                <w:color w:val="000000"/>
-                <w:sz w:val="28"/>
-                <w:szCs w:val="28"/>
-                <w:rtl/>
-              </w:rPr>
-              <w:t xml:space="preserve">) + </w:t>
-            </w:r>
-            <w:r>
-              <w:rPr>
-                <w:rFonts w:ascii="Sakkal Majalla" w:hAnsi="Sakkal Majalla" w:cs="Sakkal Majalla" w:hint="cs"/>
-                <w:color w:val="000000"/>
-                <w:sz w:val="28"/>
-                <w:szCs w:val="28"/>
-                <w:rtl/>
-              </w:rPr>
-              <w:t>المستويات</w:t>
-            </w:r>
-            <w:r>
-              <w:rPr>
-                <w:rFonts w:ascii="Sakkal Majalla" w:hAnsi="Sakkal Majalla" w:cs="Sakkal Majalla"/>
-                <w:color w:val="000000"/>
-                <w:sz w:val="28"/>
-                <w:szCs w:val="28"/>
-                <w:rtl/>
-              </w:rPr>
-              <w:t xml:space="preserve"> </w:t>
-            </w:r>
-            <w:r>
-              <w:rPr>
-                <w:rFonts w:ascii="Sakkal Majalla" w:hAnsi="Sakkal Majalla" w:cs="Sakkal Majalla" w:hint="cs"/>
-                <w:color w:val="000000"/>
-                <w:sz w:val="28"/>
-                <w:szCs w:val="28"/>
-                <w:rtl/>
-              </w:rPr>
-              <w:t>الثلاثة</w:t>
-            </w:r>
-            <w:r>
-              <w:rPr>
-                <w:rFonts w:ascii="Sakkal Majalla" w:hAnsi="Sakkal Majalla" w:cs="Sakkal Majalla"/>
-                <w:color w:val="000000"/>
-                <w:sz w:val="28"/>
-                <w:szCs w:val="28"/>
-                <w:rtl/>
-              </w:rPr>
-              <w:t xml:space="preserve"> </w:t>
-            </w:r>
-            <w:r>
-              <w:rPr>
-                <w:rFonts w:ascii="Sakkal Majalla" w:hAnsi="Sakkal Majalla" w:cs="Sakkal Majalla" w:hint="cs"/>
-                <w:color w:val="000000"/>
-                <w:sz w:val="28"/>
-                <w:szCs w:val="28"/>
-                <w:rtl/>
-              </w:rPr>
-              <w:t>للمعرفة</w:t>
-            </w:r>
-            <w:r>
-              <w:rPr>
-                <w:rFonts w:ascii="Sakkal Majalla" w:hAnsi="Sakkal Majalla" w:cs="Sakkal Majalla"/>
-                <w:color w:val="000000"/>
-                <w:sz w:val="28"/>
-                <w:szCs w:val="28"/>
-                <w:rtl/>
-              </w:rPr>
-              <w:t xml:space="preserve"> + </w:t>
-            </w:r>
-            <w:r>
-              <w:rPr>
-                <w:rFonts w:ascii="Sakkal Majalla" w:hAnsi="Sakkal Majalla" w:cs="Sakkal Majalla" w:hint="cs"/>
-                <w:color w:val="000000"/>
-                <w:sz w:val="28"/>
-                <w:szCs w:val="28"/>
-                <w:rtl/>
-              </w:rPr>
-              <w:t>هرم</w:t>
-            </w:r>
-            <w:r>
-              <w:rPr>
-                <w:rFonts w:ascii="Sakkal Majalla" w:hAnsi="Sakkal Majalla" w:cs="Sakkal Majalla"/>
-                <w:color w:val="000000"/>
-                <w:sz w:val="28"/>
-                <w:szCs w:val="28"/>
-                <w:rtl/>
-              </w:rPr>
-              <w:t xml:space="preserve"> </w:t>
-            </w:r>
-            <w:r>
-              <w:rPr>
-                <w:rFonts w:ascii="Sakkal Majalla" w:hAnsi="Sakkal Majalla" w:cs="Sakkal Majalla" w:hint="cs"/>
-                <w:color w:val="000000"/>
-                <w:sz w:val="28"/>
-                <w:szCs w:val="28"/>
-                <w:rtl/>
-              </w:rPr>
-              <w:t>المصادر</w:t>
-            </w:r>
-            <w:r>
-              <w:rPr>
-                <w:rFonts w:ascii="Sakkal Majalla" w:hAnsi="Sakkal Majalla" w:cs="Sakkal Majalla"/>
-                <w:color w:val="000000"/>
-                <w:sz w:val="28"/>
-                <w:szCs w:val="28"/>
-                <w:rtl/>
-              </w:rPr>
-              <w:t>.  • لماذا يهمك: كل قرار إداري تتخذه يبدأ من افتراض ضمني عن الإنسان وعن المعرفة وعن القيم. هذا الفصل يُسمِّي هذه الافتراضات ويُتيح لك اختيارها بوعي.</w:t>
+              <w:t xml:space="preserve">يدور الفصل حول سؤال واحد: ما الفرق بين أن نسأل «أين الإدارة في القرآن؟» وأن نسأل «ماذا ينبثق من القرآن إذا بدأنا منه؟». وللإجابة عنه يعرض الإطار المعرفي الذي يعمل فيه الكتاب، ويشرح مبدأ أقومية القرآن بمعنييه، ويصف ظاهرة القولبة التي أراها العائق الأكبر أمام معرفة إسلامية أصيلة. ويخرج القارئ منه بثلاث أدوات: جدول المسارين، والمستويات الثلاثة للمعرفة، والصورة الكلية لهرم المصادر. وأهميته للمدير أن كل قرار يتخذه يقوم على افتراض ضمني عن الإنسان والمعرفة والقيم، وهذا الفصل يحاول أن يسمّي تلك الافتراضات حتى يختارها صاحبها وهو يراها.</w:t>
             </w:r>
           </w:p>
         </w:tc>
@@ -1719,7 +1211,7 @@
           <w:szCs w:val="28"/>
           <w:rtl/>
         </w:rPr>
-        <w:t>1.1  السؤال المؤسِّس — ليس "أين الإدارة في القرآن؟"</w:t>
+        <w:t xml:space="preserve">1.1  السؤال المؤسِّس: لماذا لا نسأل «أين الإدارة في القرآن؟»</w:t>
       </w:r>
     </w:p>
     <w:p>
@@ -1740,7 +1232,7 @@
           <w:szCs w:val="28"/>
           <w:rtl/>
         </w:rPr>
-        <w:t>السؤال الذي يُؤسِّس هذا الكتاب ليس السؤال المعتاد في أدبيات الإدارة الإسلامية. السؤال المعتاد — "أين الإدارة في القرآن؟" — يبدو بريئًا لكنه يحمل افتراضًا مُضمَرًا خطيرًا: أن الإدارة كما عرَّفها الغرب هي المعيار، والقرآن مُستجوَب عنها. هذا الافتراض يجعل النظرية الغربية هي الأصل والقرآن شاهدًا عليها — وهو بالضبط ما يرفضه هذا الكتاب.</w:t>
+        <w:t xml:space="preserve">اعتادت أدبيات الإدارة الإسلامية أن تسأل: أين الإدارة في القرآن؟ ويبدو السؤال بريئًا، لكنه يفترض من غير أن يصرّح أن الإدارة كما عرّفها الغرب هي المعيار، وأن القرآن يُستدعى ليجيب عنها. وبهذا تصير النظرية الغربية هي الأصل، ويصير القرآن شاهدًا لها. وهذا بالضبط ما يحاول هذا الكتاب أن يتجنّبه.</w:t>
       </w:r>
     </w:p>
     <w:p>
@@ -1761,7 +1253,7 @@
           <w:szCs w:val="28"/>
           <w:rtl/>
         </w:rPr>
-        <w:t>السؤال الذي ينطلق منه هذا الكتاب مختلف:</w:t>
+        <w:t xml:space="preserve">أما السؤال الذي أنطلق منه فمختلف:</w:t>
       </w:r>
     </w:p>
     <w:tbl>
@@ -1856,7 +1348,7 @@
                 <w:szCs w:val="28"/>
                 <w:rtl/>
               </w:rPr>
-              <w:t>ما المنظومة الإدارية التي تنبثق حين ننطلق من القرآن الكريم — بوصفه يهدي للتي هي أقوم — ونسأل عمَّن ينسجم مع ما ينبثق، لا عمَّا يُحاكيه؟</w:t>
+              <w:t xml:space="preserve">ما المنظومة الإدارية التي تنبثق حين ننطلق من القرآن الكريم، بوصفه يهدي للتي هي أقوم، ثم نسأل عمّا ينسجم مع ما ينبثق منه، لا عمّا يحاكيه؟</w:t>
             </w:r>
           </w:p>
         </w:tc>
@@ -1880,7 +1372,7 @@
           <w:szCs w:val="28"/>
           <w:rtl/>
         </w:rPr>
-        <w:t>الفارق بين السؤالين ليس لفظيًا — بل هو فارق في نقطة الانطلاق يُنتج كل شيء آخر: من الأسئلة إلى الأدوات إلى النتائج.</w:t>
+        <w:t xml:space="preserve">قد يبدو الفرق بين السؤالين لفظيًا، لكنه فرق في نقطة البداية، ومنه تتفرّع الأسئلة والأدوات والنتائج كلها.</w:t>
       </w:r>
     </w:p>
     <w:tbl>
@@ -2470,7 +1962,7 @@
                 <w:szCs w:val="28"/>
                 <w:rtl/>
               </w:rPr>
-              <w:t>السؤال مفتوح — والإجابة من داخل القرآن</w:t>
+              <w:t xml:space="preserve">السؤال مفتوح، والإجابة من داخل القرآن</w:t>
             </w:r>
           </w:p>
         </w:tc>
@@ -2528,7 +2020,7 @@
           <w:szCs w:val="28"/>
           <w:rtl/>
         </w:rPr>
-        <w:t xml:space="preserve">وهذا المسار الثاني — الانطلاق من القرآن — لا يرفض المنهجية العلمية التي طوَّرها الفكر الغربي، بل يُوظِّفها: الفرضية الصفرية (الفصل الثالث)، والاشتقاق التدريجي (الفصل الخامس)، والاختبار التجريبي. فالمشكلة التي يعالجها الكتاب ليست في الأدوات، بل في نقطة البدء التي تُستعمل منها. ومن هنا يسعى إلى «بديل ثالث»: لا هو أسلمةٌ للنموذج الغربي بإلباسه ثوبًا إسلاميًا، ولا هو رفضٌ لأدواته المنهجية لمجرد أنها وافدة، بل انطلاقٌ من السؤال القرآني مع الاستعانة بأدق الأدوات المتاحة لاختبار ما ينتج عنه.</w:t>
+        <w:t xml:space="preserve">ولا يعني الانطلاق من القرآن أن نرفض المنهجية العلمية التي طوّرها الفكر الغربي. فالكتاب يستعملها، ويأخذ منها الفرضية الصفرية (الفصل الثالث)، والاشتقاق المتدرّج (الفصل الخامس)، والاختبار التجريبي. المشكلة عندي ليست في الأدوات، وإنما في الموضع الذي نبدأ منه قبل أن نستعملها. ولهذا أسمّي ما يسعى إليه الكتاب «بديلًا ثالثًا»: فهو لا يُلبس النموذج الغربي ثوبًا إسلاميًا، ولا يرفض أدواته لأنها وافدة، وإنما يبدأ من السؤال القرآني، ثم يستعين بأدق ما يتاح من أدوات لاختبار ما ينتج عنه.</w:t>
       </w:r>
     </w:p>
     <w:p>
@@ -2549,7 +2041,7 @@
           <w:szCs w:val="28"/>
           <w:rtl/>
         </w:rPr>
-        <w:t xml:space="preserve">وادعاء الكتاب هنا محدودٌ ومحدَّد: لا نقول إن الإدارة الغربية خاليةٌ من القيم، ولا إن كل ما أنتجه الفكر الإداري الحديث يحتاج إلى استبدال. نقول فقط إن كل نموذج إداري يحمل تصورًا ضمنيًا عن الإنسان والمعرفة والغاية والسلطة، وإن من حق الباحث المسلم أن يفحص هذه التصورات من داخل مرجعيته، وأن يبني نموذجًا لا يكون مجرد ترجمة أو تزيين. وإذا انتهى الاختبار إلى أن بعض عناصر النموذج القرآني تتوافق مع أطر غربية، فالتوافق ليس فشلًا، كما أنه ليس دليلًا كافيًا على الاستقلال؛ المطلوب معرفة مصدر المفهوم، وحدود التوافق، وهل يظهر الفرق في القرار والسلوك والنتيجة.</w:t>
+        <w:t xml:space="preserve">وأريد أن أكون دقيقًا في حدود ما أدّعيه هنا. لا أقول إن الإدارة الغربية خالية من القيم، ولا إن كل ما أنتجه الفكر الإداري الحديث ينبغي استبداله. أقول فقط إن كل نموذج إداري يحمل في داخله تصورًا عن الإنسان والمعرفة والغاية والسلطة، وإن للباحث المسلم أن يفحص هذه التصورات من داخل مرجعيته، وأن يحاول بناء نموذج لا يكون ترجمةً ولا زينة. فإن انتهى الاختبار إلى أن بعض عناصر النموذج القرآني تتفق مع أطر غربية، فليس ذلك فشلًا، ولا هو وحده دليل على الاستقلال. المهم أن نعرف من أين جاء المفهوم، وأين يتوقف التوافق، وهل يظهر الفرق في القرار والسلوك والنتيجة.</w:t>
       </w:r>
     </w:p>
     <w:p>
@@ -2574,7 +2066,7 @@
           <w:szCs w:val="28"/>
           <w:rtl/>
         </w:rPr>
-        <w:t xml:space="preserve">ملاحظة منهجية: مصطلح «البديل الثالث» مستعارٌ من ستيفن كوفي (Stephen Covey, The 3rd Alternative, 2011) بمعناه العام: البحث عن حلٍّ يتجاوز طرفَي ثنائيةٍ مغلقة. ويسعى الكتاب — بحسب اطلاع الباحث — إلى مقاربة لم يكتمل بناؤها في الأدبيات المتاحة: توظيف المنهجية الصارمة في خدمة السؤال القرآني.</w:t>
+        <w:t xml:space="preserve">ملاحظة منهجية: استعرتُ عبارة «البديل الثالث» من ستيفن كوفي (Stephen Covey, The 3rd Alternative, 2011) بمعناها العام، أي البحث عن حلٍّ يتجاوز ثنائيةً مغلقة. ولم أجد، في حدود ما اطلعتُ عليه، محاولةً مكتملة لتوظيف المنهجية الصارمة في خدمة السؤال القرآني على هذا النحو.</w:t>
       </w:r>
     </w:p>
     <w:p>
@@ -2612,7 +2104,7 @@
           <w:szCs w:val="28"/>
           <w:rtl/>
         </w:rPr>
-        <w:t>1.2  الإطار الابستيمولوجي الإسلامي — إعلان رسمي</w:t>
+        <w:t xml:space="preserve">1.2  الإطار الابستيمولوجي الإسلامي: ما الذي نسلّم به وما الذي نختبره</w:t>
       </w:r>
     </w:p>
     <w:tbl>
@@ -2669,223 +2161,7 @@
                 <w:szCs w:val="28"/>
                 <w:rtl/>
               </w:rPr>
-              <w:t>📦</w:t>
-            </w:r>
-            <w:r>
-              <w:rPr>
-                <w:rFonts w:ascii="Sakkal Majalla" w:hAnsi="Sakkal Majalla" w:cs="Sakkal Majalla"/>
-                <w:b/>
-                <w:bCs/>
-                <w:color w:val="FFFFFF"/>
-                <w:sz w:val="28"/>
-                <w:szCs w:val="28"/>
-                <w:rtl/>
-              </w:rPr>
-              <w:t xml:space="preserve">  </w:t>
-            </w:r>
-            <w:r>
-              <w:rPr>
-                <w:rFonts w:ascii="Sakkal Majalla" w:hAnsi="Sakkal Majalla" w:cs="Sakkal Majalla" w:hint="cs"/>
-                <w:b/>
-                <w:bCs/>
-                <w:color w:val="FFFFFF"/>
-                <w:sz w:val="28"/>
-                <w:szCs w:val="28"/>
-                <w:rtl/>
-              </w:rPr>
-              <w:t>ما</w:t>
-            </w:r>
-            <w:r>
-              <w:rPr>
-                <w:rFonts w:ascii="Sakkal Majalla" w:hAnsi="Sakkal Majalla" w:cs="Sakkal Majalla"/>
-                <w:b/>
-                <w:bCs/>
-                <w:color w:val="FFFFFF"/>
-                <w:sz w:val="28"/>
-                <w:szCs w:val="28"/>
-                <w:rtl/>
-              </w:rPr>
-              <w:t xml:space="preserve"> </w:t>
-            </w:r>
-            <w:r>
-              <w:rPr>
-                <w:rFonts w:ascii="Sakkal Majalla" w:hAnsi="Sakkal Majalla" w:cs="Sakkal Majalla" w:hint="cs"/>
-                <w:b/>
-                <w:bCs/>
-                <w:color w:val="FFFFFF"/>
-                <w:sz w:val="28"/>
-                <w:szCs w:val="28"/>
-                <w:rtl/>
-              </w:rPr>
-              <w:t>معنى</w:t>
-            </w:r>
-            <w:r>
-              <w:rPr>
-                <w:rFonts w:ascii="Sakkal Majalla" w:hAnsi="Sakkal Majalla" w:cs="Sakkal Majalla"/>
-                <w:b/>
-                <w:bCs/>
-                <w:color w:val="FFFFFF"/>
-                <w:sz w:val="28"/>
-                <w:szCs w:val="28"/>
-                <w:rtl/>
-              </w:rPr>
-              <w:t xml:space="preserve"> "</w:t>
-            </w:r>
-            <w:r>
-              <w:rPr>
-                <w:rFonts w:ascii="Sakkal Majalla" w:hAnsi="Sakkal Majalla" w:cs="Sakkal Majalla" w:hint="cs"/>
-                <w:b/>
-                <w:bCs/>
-                <w:color w:val="FFFFFF"/>
-                <w:sz w:val="28"/>
-                <w:szCs w:val="28"/>
-                <w:rtl/>
-              </w:rPr>
-              <w:t>الإطار</w:t>
-            </w:r>
-            <w:r>
-              <w:rPr>
-                <w:rFonts w:ascii="Sakkal Majalla" w:hAnsi="Sakkal Majalla" w:cs="Sakkal Majalla"/>
-                <w:b/>
-                <w:bCs/>
-                <w:color w:val="FFFFFF"/>
-                <w:sz w:val="28"/>
-                <w:szCs w:val="28"/>
-                <w:rtl/>
-              </w:rPr>
-              <w:t xml:space="preserve"> </w:t>
-            </w:r>
-            <w:r>
-              <w:rPr>
-                <w:rFonts w:ascii="Sakkal Majalla" w:hAnsi="Sakkal Majalla" w:cs="Sakkal Majalla" w:hint="cs"/>
-                <w:b/>
-                <w:bCs/>
-                <w:color w:val="FFFFFF"/>
-                <w:sz w:val="28"/>
-                <w:szCs w:val="28"/>
-                <w:rtl/>
-              </w:rPr>
-              <w:t>الابستيمولوجي</w:t>
-            </w:r>
-            <w:r>
-              <w:rPr>
-                <w:rFonts w:ascii="Sakkal Majalla" w:hAnsi="Sakkal Majalla" w:cs="Sakkal Majalla"/>
-                <w:b/>
-                <w:bCs/>
-                <w:color w:val="FFFFFF"/>
-                <w:sz w:val="28"/>
-                <w:szCs w:val="28"/>
-                <w:rtl/>
-              </w:rPr>
-              <w:t>"</w:t>
-            </w:r>
-            <w:r>
-              <w:rPr>
-                <w:rFonts w:ascii="Sakkal Majalla" w:hAnsi="Sakkal Majalla" w:cs="Sakkal Majalla" w:hint="cs"/>
-                <w:b/>
-                <w:bCs/>
-                <w:color w:val="FFFFFF"/>
-                <w:sz w:val="28"/>
-                <w:szCs w:val="28"/>
-                <w:rtl/>
-              </w:rPr>
-              <w:t>؟</w:t>
-            </w:r>
-            <w:r>
-              <w:rPr>
-                <w:rFonts w:ascii="Sakkal Majalla" w:hAnsi="Sakkal Majalla" w:cs="Sakkal Majalla"/>
-                <w:b/>
-                <w:bCs/>
-                <w:color w:val="FFFFFF"/>
-                <w:sz w:val="28"/>
-                <w:szCs w:val="28"/>
-                <w:rtl/>
-              </w:rPr>
-              <w:t xml:space="preserve"> </w:t>
-            </w:r>
-            <w:r>
-              <w:rPr>
-                <w:rFonts w:ascii="Sakkal Majalla" w:hAnsi="Sakkal Majalla" w:cs="Sakkal Majalla" w:hint="cs"/>
-                <w:b/>
-                <w:bCs/>
-                <w:color w:val="FFFFFF"/>
-                <w:sz w:val="28"/>
-                <w:szCs w:val="28"/>
-                <w:rtl/>
-              </w:rPr>
-              <w:t>—</w:t>
-            </w:r>
-            <w:r>
-              <w:rPr>
-                <w:rFonts w:ascii="Sakkal Majalla" w:hAnsi="Sakkal Majalla" w:cs="Sakkal Majalla"/>
-                <w:b/>
-                <w:bCs/>
-                <w:color w:val="FFFFFF"/>
-                <w:sz w:val="28"/>
-                <w:szCs w:val="28"/>
-                <w:rtl/>
-              </w:rPr>
-              <w:t xml:space="preserve"> </w:t>
-            </w:r>
-            <w:r>
-              <w:rPr>
-                <w:rFonts w:ascii="Sakkal Majalla" w:hAnsi="Sakkal Majalla" w:cs="Sakkal Majalla" w:hint="cs"/>
-                <w:b/>
-                <w:bCs/>
-                <w:color w:val="FFFFFF"/>
-                <w:sz w:val="28"/>
-                <w:szCs w:val="28"/>
-                <w:rtl/>
-              </w:rPr>
-              <w:t>في</w:t>
-            </w:r>
-            <w:r>
-              <w:rPr>
-                <w:rFonts w:ascii="Sakkal Majalla" w:hAnsi="Sakkal Majalla" w:cs="Sakkal Majalla"/>
-                <w:b/>
-                <w:bCs/>
-                <w:color w:val="FFFFFF"/>
-                <w:sz w:val="28"/>
-                <w:szCs w:val="28"/>
-                <w:rtl/>
-              </w:rPr>
-              <w:t xml:space="preserve"> </w:t>
-            </w:r>
-            <w:r>
-              <w:rPr>
-                <w:rFonts w:ascii="Sakkal Majalla" w:hAnsi="Sakkal Majalla" w:cs="Sakkal Majalla" w:hint="cs"/>
-                <w:b/>
-                <w:bCs/>
-                <w:color w:val="FFFFFF"/>
-                <w:sz w:val="28"/>
-                <w:szCs w:val="28"/>
-                <w:rtl/>
-              </w:rPr>
-              <w:t>لغة</w:t>
-            </w:r>
-            <w:r>
-              <w:rPr>
-                <w:rFonts w:ascii="Sakkal Majalla" w:hAnsi="Sakkal Majalla" w:cs="Sakkal Majalla"/>
-                <w:b/>
-                <w:bCs/>
-                <w:color w:val="FFFFFF"/>
-                <w:sz w:val="28"/>
-                <w:szCs w:val="28"/>
-                <w:rtl/>
-              </w:rPr>
-              <w:t xml:space="preserve"> </w:t>
-            </w:r>
-            <w:r>
-              <w:rPr>
-                <w:rFonts w:ascii="Sakkal Majalla" w:hAnsi="Sakkal Majalla" w:cs="Sakkal Majalla" w:hint="cs"/>
-                <w:b/>
-                <w:bCs/>
-                <w:color w:val="FFFFFF"/>
-                <w:sz w:val="28"/>
-                <w:szCs w:val="28"/>
-                <w:rtl/>
-              </w:rPr>
-              <w:t>المدير</w:t>
+              <w:t xml:space="preserve">ما المقصود بـ«الإطار الابستيمولوجي»؟</w:t>
             </w:r>
           </w:p>
         </w:tc>
@@ -2921,1567 +2197,7 @@
                 <w:szCs w:val="28"/>
                 <w:rtl/>
               </w:rPr>
-              <w:t xml:space="preserve">الابستيمولوجيا (Epistemology) هي "علم المعرفة" — يُجيب عن ثلاثة أسئلة:     </w:t>
-            </w:r>
-            <w:r>
-              <w:rPr>
-                <w:rFonts w:ascii="Cambria Math" w:hAnsi="Cambria Math" w:cs="Cambria Math" w:hint="cs"/>
-                <w:color w:val="000000"/>
-                <w:sz w:val="28"/>
-                <w:szCs w:val="28"/>
-                <w:rtl/>
-              </w:rPr>
-              <w:t>①</w:t>
-            </w:r>
-            <w:r>
-              <w:rPr>
-                <w:rFonts w:ascii="Sakkal Majalla" w:hAnsi="Sakkal Majalla" w:cs="Sakkal Majalla"/>
-                <w:color w:val="000000"/>
-                <w:sz w:val="28"/>
-                <w:szCs w:val="28"/>
-                <w:rtl/>
-              </w:rPr>
-              <w:t xml:space="preserve">  </w:t>
-            </w:r>
-            <w:r>
-              <w:rPr>
-                <w:rFonts w:ascii="Sakkal Majalla" w:hAnsi="Sakkal Majalla" w:cs="Sakkal Majalla" w:hint="cs"/>
-                <w:color w:val="000000"/>
-                <w:sz w:val="28"/>
-                <w:szCs w:val="28"/>
-                <w:rtl/>
-              </w:rPr>
-              <w:t>من</w:t>
-            </w:r>
-            <w:r>
-              <w:rPr>
-                <w:rFonts w:ascii="Sakkal Majalla" w:hAnsi="Sakkal Majalla" w:cs="Sakkal Majalla"/>
-                <w:color w:val="000000"/>
-                <w:sz w:val="28"/>
-                <w:szCs w:val="28"/>
-                <w:rtl/>
-              </w:rPr>
-              <w:t xml:space="preserve"> </w:t>
-            </w:r>
-            <w:r>
-              <w:rPr>
-                <w:rFonts w:ascii="Sakkal Majalla" w:hAnsi="Sakkal Majalla" w:cs="Sakkal Majalla" w:hint="cs"/>
-                <w:color w:val="000000"/>
-                <w:sz w:val="28"/>
-                <w:szCs w:val="28"/>
-                <w:rtl/>
-              </w:rPr>
-              <w:t>أين</w:t>
-            </w:r>
-            <w:r>
-              <w:rPr>
-                <w:rFonts w:ascii="Sakkal Majalla" w:hAnsi="Sakkal Majalla" w:cs="Sakkal Majalla"/>
-                <w:color w:val="000000"/>
-                <w:sz w:val="28"/>
-                <w:szCs w:val="28"/>
-                <w:rtl/>
-              </w:rPr>
-              <w:t xml:space="preserve"> </w:t>
-            </w:r>
-            <w:r>
-              <w:rPr>
-                <w:rFonts w:ascii="Sakkal Majalla" w:hAnsi="Sakkal Majalla" w:cs="Sakkal Majalla" w:hint="cs"/>
-                <w:color w:val="000000"/>
-                <w:sz w:val="28"/>
-                <w:szCs w:val="28"/>
-                <w:rtl/>
-              </w:rPr>
-              <w:t>تأتي</w:t>
-            </w:r>
-            <w:r>
-              <w:rPr>
-                <w:rFonts w:ascii="Sakkal Majalla" w:hAnsi="Sakkal Majalla" w:cs="Sakkal Majalla"/>
-                <w:color w:val="000000"/>
-                <w:sz w:val="28"/>
-                <w:szCs w:val="28"/>
-                <w:rtl/>
-              </w:rPr>
-              <w:t xml:space="preserve"> </w:t>
-            </w:r>
-            <w:r>
-              <w:rPr>
-                <w:rFonts w:ascii="Sakkal Majalla" w:hAnsi="Sakkal Majalla" w:cs="Sakkal Majalla" w:hint="cs"/>
-                <w:color w:val="000000"/>
-                <w:sz w:val="28"/>
-                <w:szCs w:val="28"/>
-                <w:rtl/>
-              </w:rPr>
-              <w:t>المعرفة؟</w:t>
-            </w:r>
-            <w:r>
-              <w:rPr>
-                <w:rFonts w:ascii="Sakkal Majalla" w:hAnsi="Sakkal Majalla" w:cs="Sakkal Majalla"/>
-                <w:color w:val="000000"/>
-                <w:sz w:val="28"/>
-                <w:szCs w:val="28"/>
-                <w:rtl/>
-              </w:rPr>
-              <w:t xml:space="preserve"> (</w:t>
-            </w:r>
-            <w:r>
-              <w:rPr>
-                <w:rFonts w:ascii="Sakkal Majalla" w:hAnsi="Sakkal Majalla" w:cs="Sakkal Majalla" w:hint="cs"/>
-                <w:color w:val="000000"/>
-                <w:sz w:val="28"/>
-                <w:szCs w:val="28"/>
-                <w:rtl/>
-              </w:rPr>
-              <w:t>الوحي؟</w:t>
-            </w:r>
-            <w:r>
-              <w:rPr>
-                <w:rFonts w:ascii="Sakkal Majalla" w:hAnsi="Sakkal Majalla" w:cs="Sakkal Majalla"/>
-                <w:color w:val="000000"/>
-                <w:sz w:val="28"/>
-                <w:szCs w:val="28"/>
-                <w:rtl/>
-              </w:rPr>
-              <w:t xml:space="preserve"> </w:t>
-            </w:r>
-            <w:r>
-              <w:rPr>
-                <w:rFonts w:ascii="Sakkal Majalla" w:hAnsi="Sakkal Majalla" w:cs="Sakkal Majalla" w:hint="cs"/>
-                <w:color w:val="000000"/>
-                <w:sz w:val="28"/>
-                <w:szCs w:val="28"/>
-                <w:rtl/>
-              </w:rPr>
-              <w:t>العقل؟</w:t>
-            </w:r>
-            <w:r>
-              <w:rPr>
-                <w:rFonts w:ascii="Sakkal Majalla" w:hAnsi="Sakkal Majalla" w:cs="Sakkal Majalla"/>
-                <w:color w:val="000000"/>
-                <w:sz w:val="28"/>
-                <w:szCs w:val="28"/>
-                <w:rtl/>
-              </w:rPr>
-              <w:t xml:space="preserve"> </w:t>
-            </w:r>
-            <w:r>
-              <w:rPr>
-                <w:rFonts w:ascii="Sakkal Majalla" w:hAnsi="Sakkal Majalla" w:cs="Sakkal Majalla" w:hint="cs"/>
-                <w:color w:val="000000"/>
-                <w:sz w:val="28"/>
-                <w:szCs w:val="28"/>
-                <w:rtl/>
-              </w:rPr>
-              <w:t>التجربة؟</w:t>
-            </w:r>
-            <w:r>
-              <w:rPr>
-                <w:rFonts w:ascii="Sakkal Majalla" w:hAnsi="Sakkal Majalla" w:cs="Sakkal Majalla"/>
-                <w:color w:val="000000"/>
-                <w:sz w:val="28"/>
-                <w:szCs w:val="28"/>
-                <w:rtl/>
-              </w:rPr>
-              <w:t xml:space="preserve">)     </w:t>
-            </w:r>
-            <w:r>
-              <w:rPr>
-                <w:rFonts w:ascii="Cambria Math" w:hAnsi="Cambria Math" w:cs="Cambria Math" w:hint="cs"/>
-                <w:color w:val="000000"/>
-                <w:sz w:val="28"/>
-                <w:szCs w:val="28"/>
-                <w:rtl/>
-              </w:rPr>
-              <w:t>②</w:t>
-            </w:r>
-            <w:r>
-              <w:rPr>
-                <w:rFonts w:ascii="Sakkal Majalla" w:hAnsi="Sakkal Majalla" w:cs="Sakkal Majalla"/>
-                <w:color w:val="000000"/>
-                <w:sz w:val="28"/>
-                <w:szCs w:val="28"/>
-                <w:rtl/>
-              </w:rPr>
-              <w:t xml:space="preserve">  </w:t>
-            </w:r>
-            <w:r>
-              <w:rPr>
-                <w:rFonts w:ascii="Sakkal Majalla" w:hAnsi="Sakkal Majalla" w:cs="Sakkal Majalla" w:hint="cs"/>
-                <w:color w:val="000000"/>
-                <w:sz w:val="28"/>
-                <w:szCs w:val="28"/>
-                <w:rtl/>
-              </w:rPr>
-              <w:t>ما</w:t>
-            </w:r>
-            <w:r>
-              <w:rPr>
-                <w:rFonts w:ascii="Sakkal Majalla" w:hAnsi="Sakkal Majalla" w:cs="Sakkal Majalla"/>
-                <w:color w:val="000000"/>
-                <w:sz w:val="28"/>
-                <w:szCs w:val="28"/>
-                <w:rtl/>
-              </w:rPr>
-              <w:t xml:space="preserve"> </w:t>
-            </w:r>
-            <w:r>
-              <w:rPr>
-                <w:rFonts w:ascii="Sakkal Majalla" w:hAnsi="Sakkal Majalla" w:cs="Sakkal Majalla" w:hint="cs"/>
-                <w:color w:val="000000"/>
-                <w:sz w:val="28"/>
-                <w:szCs w:val="28"/>
-                <w:rtl/>
-              </w:rPr>
-              <w:t>الذي</w:t>
-            </w:r>
-            <w:r>
-              <w:rPr>
-                <w:rFonts w:ascii="Sakkal Majalla" w:hAnsi="Sakkal Majalla" w:cs="Sakkal Majalla"/>
-                <w:color w:val="000000"/>
-                <w:sz w:val="28"/>
-                <w:szCs w:val="28"/>
-                <w:rtl/>
-              </w:rPr>
-              <w:t xml:space="preserve"> </w:t>
-            </w:r>
-            <w:r>
-              <w:rPr>
-                <w:rFonts w:ascii="Sakkal Majalla" w:hAnsi="Sakkal Majalla" w:cs="Sakkal Majalla" w:hint="cs"/>
-                <w:color w:val="000000"/>
-                <w:sz w:val="28"/>
-                <w:szCs w:val="28"/>
-                <w:rtl/>
-              </w:rPr>
-              <w:t>نُسلِّم</w:t>
-            </w:r>
-            <w:r>
-              <w:rPr>
-                <w:rFonts w:ascii="Sakkal Majalla" w:hAnsi="Sakkal Majalla" w:cs="Sakkal Majalla"/>
-                <w:color w:val="000000"/>
-                <w:sz w:val="28"/>
-                <w:szCs w:val="28"/>
-                <w:rtl/>
-              </w:rPr>
-              <w:t xml:space="preserve"> </w:t>
-            </w:r>
-            <w:r>
-              <w:rPr>
-                <w:rFonts w:ascii="Sakkal Majalla" w:hAnsi="Sakkal Majalla" w:cs="Sakkal Majalla" w:hint="cs"/>
-                <w:color w:val="000000"/>
-                <w:sz w:val="28"/>
-                <w:szCs w:val="28"/>
-                <w:rtl/>
-              </w:rPr>
-              <w:t>به</w:t>
-            </w:r>
-            <w:r>
-              <w:rPr>
-                <w:rFonts w:ascii="Sakkal Majalla" w:hAnsi="Sakkal Majalla" w:cs="Sakkal Majalla"/>
-                <w:color w:val="000000"/>
-                <w:sz w:val="28"/>
-                <w:szCs w:val="28"/>
-                <w:rtl/>
-              </w:rPr>
-              <w:t xml:space="preserve"> </w:t>
-            </w:r>
-            <w:r>
-              <w:rPr>
-                <w:rFonts w:ascii="Sakkal Majalla" w:hAnsi="Sakkal Majalla" w:cs="Sakkal Majalla" w:hint="cs"/>
-                <w:color w:val="000000"/>
-                <w:sz w:val="28"/>
-                <w:szCs w:val="28"/>
-                <w:rtl/>
-              </w:rPr>
-              <w:t>دون</w:t>
-            </w:r>
-            <w:r>
-              <w:rPr>
-                <w:rFonts w:ascii="Sakkal Majalla" w:hAnsi="Sakkal Majalla" w:cs="Sakkal Majalla"/>
-                <w:color w:val="000000"/>
-                <w:sz w:val="28"/>
-                <w:szCs w:val="28"/>
-                <w:rtl/>
-              </w:rPr>
-              <w:t xml:space="preserve"> </w:t>
-            </w:r>
-            <w:r>
-              <w:rPr>
-                <w:rFonts w:ascii="Sakkal Majalla" w:hAnsi="Sakkal Majalla" w:cs="Sakkal Majalla" w:hint="cs"/>
-                <w:color w:val="000000"/>
-                <w:sz w:val="28"/>
-                <w:szCs w:val="28"/>
-                <w:rtl/>
-              </w:rPr>
-              <w:t>اختبار؟</w:t>
-            </w:r>
-            <w:r>
-              <w:rPr>
-                <w:rFonts w:ascii="Sakkal Majalla" w:hAnsi="Sakkal Majalla" w:cs="Sakkal Majalla"/>
-                <w:color w:val="000000"/>
-                <w:sz w:val="28"/>
-                <w:szCs w:val="28"/>
-                <w:rtl/>
-              </w:rPr>
-              <w:t xml:space="preserve"> </w:t>
-            </w:r>
-            <w:r>
-              <w:rPr>
-                <w:rFonts w:ascii="Sakkal Majalla" w:hAnsi="Sakkal Majalla" w:cs="Sakkal Majalla" w:hint="cs"/>
-                <w:color w:val="000000"/>
-                <w:sz w:val="28"/>
-                <w:szCs w:val="28"/>
-                <w:rtl/>
-              </w:rPr>
-              <w:t>وما</w:t>
-            </w:r>
-            <w:r>
-              <w:rPr>
-                <w:rFonts w:ascii="Sakkal Majalla" w:hAnsi="Sakkal Majalla" w:cs="Sakkal Majalla"/>
-                <w:color w:val="000000"/>
-                <w:sz w:val="28"/>
-                <w:szCs w:val="28"/>
-                <w:rtl/>
-              </w:rPr>
-              <w:t xml:space="preserve"> </w:t>
-            </w:r>
-            <w:r>
-              <w:rPr>
-                <w:rFonts w:ascii="Sakkal Majalla" w:hAnsi="Sakkal Majalla" w:cs="Sakkal Majalla" w:hint="cs"/>
-                <w:color w:val="000000"/>
-                <w:sz w:val="28"/>
-                <w:szCs w:val="28"/>
-                <w:rtl/>
-              </w:rPr>
-              <w:t>الذي</w:t>
-            </w:r>
-            <w:r>
-              <w:rPr>
-                <w:rFonts w:ascii="Sakkal Majalla" w:hAnsi="Sakkal Majalla" w:cs="Sakkal Majalla"/>
-                <w:color w:val="000000"/>
-                <w:sz w:val="28"/>
-                <w:szCs w:val="28"/>
-                <w:rtl/>
-              </w:rPr>
-              <w:t xml:space="preserve"> </w:t>
-            </w:r>
-            <w:r>
-              <w:rPr>
-                <w:rFonts w:ascii="Sakkal Majalla" w:hAnsi="Sakkal Majalla" w:cs="Sakkal Majalla" w:hint="cs"/>
-                <w:color w:val="000000"/>
-                <w:sz w:val="28"/>
-                <w:szCs w:val="28"/>
-                <w:rtl/>
-              </w:rPr>
-              <w:t>يقبل</w:t>
-            </w:r>
-            <w:r>
-              <w:rPr>
-                <w:rFonts w:ascii="Sakkal Majalla" w:hAnsi="Sakkal Majalla" w:cs="Sakkal Majalla"/>
-                <w:color w:val="000000"/>
-                <w:sz w:val="28"/>
-                <w:szCs w:val="28"/>
-                <w:rtl/>
-              </w:rPr>
-              <w:t xml:space="preserve"> </w:t>
-            </w:r>
-            <w:r>
-              <w:rPr>
-                <w:rFonts w:ascii="Sakkal Majalla" w:hAnsi="Sakkal Majalla" w:cs="Sakkal Majalla" w:hint="cs"/>
-                <w:color w:val="000000"/>
-                <w:sz w:val="28"/>
-                <w:szCs w:val="28"/>
-                <w:rtl/>
-              </w:rPr>
-              <w:t>الاختبار؟</w:t>
-            </w:r>
-            <w:r>
-              <w:rPr>
-                <w:rFonts w:ascii="Sakkal Majalla" w:hAnsi="Sakkal Majalla" w:cs="Sakkal Majalla"/>
-                <w:color w:val="000000"/>
-                <w:sz w:val="28"/>
-                <w:szCs w:val="28"/>
-                <w:rtl/>
-              </w:rPr>
-              <w:t xml:space="preserve">     </w:t>
-            </w:r>
-            <w:r>
-              <w:rPr>
-                <w:rFonts w:ascii="Cambria Math" w:hAnsi="Cambria Math" w:cs="Cambria Math" w:hint="cs"/>
-                <w:color w:val="000000"/>
-                <w:sz w:val="28"/>
-                <w:szCs w:val="28"/>
-                <w:rtl/>
-              </w:rPr>
-              <w:t>③</w:t>
-            </w:r>
-            <w:r>
-              <w:rPr>
-                <w:rFonts w:ascii="Sakkal Majalla" w:hAnsi="Sakkal Majalla" w:cs="Sakkal Majalla"/>
-                <w:color w:val="000000"/>
-                <w:sz w:val="28"/>
-                <w:szCs w:val="28"/>
-                <w:rtl/>
-              </w:rPr>
-              <w:t xml:space="preserve">  </w:t>
-            </w:r>
-            <w:r>
-              <w:rPr>
-                <w:rFonts w:ascii="Sakkal Majalla" w:hAnsi="Sakkal Majalla" w:cs="Sakkal Majalla" w:hint="cs"/>
-                <w:color w:val="000000"/>
-                <w:sz w:val="28"/>
-                <w:szCs w:val="28"/>
-                <w:rtl/>
-              </w:rPr>
-              <w:t>كيف</w:t>
-            </w:r>
-            <w:r>
-              <w:rPr>
-                <w:rFonts w:ascii="Sakkal Majalla" w:hAnsi="Sakkal Majalla" w:cs="Sakkal Majalla"/>
-                <w:color w:val="000000"/>
-                <w:sz w:val="28"/>
-                <w:szCs w:val="28"/>
-                <w:rtl/>
-              </w:rPr>
-              <w:t xml:space="preserve"> </w:t>
-            </w:r>
-            <w:r>
-              <w:rPr>
-                <w:rFonts w:ascii="Sakkal Majalla" w:hAnsi="Sakkal Majalla" w:cs="Sakkal Majalla" w:hint="cs"/>
-                <w:color w:val="000000"/>
-                <w:sz w:val="28"/>
-                <w:szCs w:val="28"/>
-                <w:rtl/>
-              </w:rPr>
-              <w:t>نُقرِّر</w:t>
-            </w:r>
-            <w:r>
-              <w:rPr>
-                <w:rFonts w:ascii="Sakkal Majalla" w:hAnsi="Sakkal Majalla" w:cs="Sakkal Majalla"/>
-                <w:color w:val="000000"/>
-                <w:sz w:val="28"/>
-                <w:szCs w:val="28"/>
-                <w:rtl/>
-              </w:rPr>
-              <w:t xml:space="preserve"> </w:t>
-            </w:r>
-            <w:r>
-              <w:rPr>
-                <w:rFonts w:ascii="Sakkal Majalla" w:hAnsi="Sakkal Majalla" w:cs="Sakkal Majalla" w:hint="cs"/>
-                <w:color w:val="000000"/>
-                <w:sz w:val="28"/>
-                <w:szCs w:val="28"/>
-                <w:rtl/>
-              </w:rPr>
-              <w:t>أن</w:t>
-            </w:r>
-            <w:r>
-              <w:rPr>
-                <w:rFonts w:ascii="Sakkal Majalla" w:hAnsi="Sakkal Majalla" w:cs="Sakkal Majalla"/>
-                <w:color w:val="000000"/>
-                <w:sz w:val="28"/>
-                <w:szCs w:val="28"/>
-                <w:rtl/>
-              </w:rPr>
-              <w:t xml:space="preserve"> </w:t>
-            </w:r>
-            <w:r>
-              <w:rPr>
-                <w:rFonts w:ascii="Sakkal Majalla" w:hAnsi="Sakkal Majalla" w:cs="Sakkal Majalla" w:hint="cs"/>
-                <w:color w:val="000000"/>
-                <w:sz w:val="28"/>
-                <w:szCs w:val="28"/>
-                <w:rtl/>
-              </w:rPr>
-              <w:t>معرفةً</w:t>
-            </w:r>
-            <w:r>
-              <w:rPr>
-                <w:rFonts w:ascii="Sakkal Majalla" w:hAnsi="Sakkal Majalla" w:cs="Sakkal Majalla"/>
-                <w:color w:val="000000"/>
-                <w:sz w:val="28"/>
-                <w:szCs w:val="28"/>
-                <w:rtl/>
-              </w:rPr>
-              <w:t xml:space="preserve"> </w:t>
-            </w:r>
-            <w:r>
-              <w:rPr>
-                <w:rFonts w:ascii="Sakkal Majalla" w:hAnsi="Sakkal Majalla" w:cs="Sakkal Majalla" w:hint="cs"/>
-                <w:color w:val="000000"/>
-                <w:sz w:val="28"/>
-                <w:szCs w:val="28"/>
-                <w:rtl/>
-              </w:rPr>
-              <w:t>ما</w:t>
-            </w:r>
-            <w:r>
-              <w:rPr>
-                <w:rFonts w:ascii="Sakkal Majalla" w:hAnsi="Sakkal Majalla" w:cs="Sakkal Majalla"/>
-                <w:color w:val="000000"/>
-                <w:sz w:val="28"/>
-                <w:szCs w:val="28"/>
-                <w:rtl/>
-              </w:rPr>
-              <w:t xml:space="preserve"> </w:t>
-            </w:r>
-            <w:r>
-              <w:rPr>
-                <w:rFonts w:ascii="Sakkal Majalla" w:hAnsi="Sakkal Majalla" w:cs="Sakkal Majalla" w:hint="cs"/>
-                <w:color w:val="000000"/>
-                <w:sz w:val="28"/>
-                <w:szCs w:val="28"/>
-                <w:rtl/>
-              </w:rPr>
-              <w:t>صحيحة؟</w:t>
-            </w:r>
-            <w:r>
-              <w:rPr>
-                <w:rFonts w:ascii="Sakkal Majalla" w:hAnsi="Sakkal Majalla" w:cs="Sakkal Majalla"/>
-                <w:color w:val="000000"/>
-                <w:sz w:val="28"/>
-                <w:szCs w:val="28"/>
-                <w:rtl/>
-              </w:rPr>
-              <w:t xml:space="preserve">  "</w:t>
-            </w:r>
-            <w:r>
-              <w:rPr>
-                <w:rFonts w:ascii="Sakkal Majalla" w:hAnsi="Sakkal Majalla" w:cs="Sakkal Majalla" w:hint="cs"/>
-                <w:color w:val="000000"/>
-                <w:sz w:val="28"/>
-                <w:szCs w:val="28"/>
-                <w:rtl/>
-              </w:rPr>
-              <w:t>الإطار</w:t>
-            </w:r>
-            <w:r>
-              <w:rPr>
-                <w:rFonts w:ascii="Sakkal Majalla" w:hAnsi="Sakkal Majalla" w:cs="Sakkal Majalla"/>
-                <w:color w:val="000000"/>
-                <w:sz w:val="28"/>
-                <w:szCs w:val="28"/>
-                <w:rtl/>
-              </w:rPr>
-              <w:t xml:space="preserve"> </w:t>
-            </w:r>
-            <w:r>
-              <w:rPr>
-                <w:rFonts w:ascii="Sakkal Majalla" w:hAnsi="Sakkal Majalla" w:cs="Sakkal Majalla" w:hint="cs"/>
-                <w:color w:val="000000"/>
-                <w:sz w:val="28"/>
-                <w:szCs w:val="28"/>
-                <w:rtl/>
-              </w:rPr>
-              <w:t>الابستيمولوجي</w:t>
-            </w:r>
-            <w:r>
-              <w:rPr>
-                <w:rFonts w:ascii="Sakkal Majalla" w:hAnsi="Sakkal Majalla" w:cs="Sakkal Majalla"/>
-                <w:color w:val="000000"/>
-                <w:sz w:val="28"/>
-                <w:szCs w:val="28"/>
-                <w:rtl/>
-              </w:rPr>
-              <w:t xml:space="preserve">" = </w:t>
-            </w:r>
-            <w:r>
-              <w:rPr>
-                <w:rFonts w:ascii="Sakkal Majalla" w:hAnsi="Sakkal Majalla" w:cs="Sakkal Majalla" w:hint="cs"/>
-                <w:color w:val="000000"/>
-                <w:sz w:val="28"/>
-                <w:szCs w:val="28"/>
-                <w:rtl/>
-              </w:rPr>
-              <w:t>خريطة</w:t>
-            </w:r>
-            <w:r>
-              <w:rPr>
-                <w:rFonts w:ascii="Sakkal Majalla" w:hAnsi="Sakkal Majalla" w:cs="Sakkal Majalla"/>
-                <w:color w:val="000000"/>
-                <w:sz w:val="28"/>
-                <w:szCs w:val="28"/>
-                <w:rtl/>
-              </w:rPr>
-              <w:t xml:space="preserve"> </w:t>
-            </w:r>
-            <w:r>
-              <w:rPr>
-                <w:rFonts w:ascii="Sakkal Majalla" w:hAnsi="Sakkal Majalla" w:cs="Sakkal Majalla" w:hint="cs"/>
-                <w:color w:val="000000"/>
-                <w:sz w:val="28"/>
-                <w:szCs w:val="28"/>
-                <w:rtl/>
-              </w:rPr>
-              <w:t>الطريق</w:t>
-            </w:r>
-            <w:r>
-              <w:rPr>
-                <w:rFonts w:ascii="Sakkal Majalla" w:hAnsi="Sakkal Majalla" w:cs="Sakkal Majalla"/>
-                <w:color w:val="000000"/>
-                <w:sz w:val="28"/>
-                <w:szCs w:val="28"/>
-                <w:rtl/>
-              </w:rPr>
-              <w:t xml:space="preserve"> </w:t>
-            </w:r>
-            <w:r>
-              <w:rPr>
-                <w:rFonts w:ascii="Sakkal Majalla" w:hAnsi="Sakkal Majalla" w:cs="Sakkal Majalla" w:hint="cs"/>
-                <w:color w:val="000000"/>
-                <w:sz w:val="28"/>
-                <w:szCs w:val="28"/>
-                <w:rtl/>
-              </w:rPr>
-              <w:t>لكيفية</w:t>
-            </w:r>
-            <w:r>
-              <w:rPr>
-                <w:rFonts w:ascii="Sakkal Majalla" w:hAnsi="Sakkal Majalla" w:cs="Sakkal Majalla"/>
-                <w:color w:val="000000"/>
-                <w:sz w:val="28"/>
-                <w:szCs w:val="28"/>
-                <w:rtl/>
-              </w:rPr>
-              <w:t xml:space="preserve"> </w:t>
-            </w:r>
-            <w:r>
-              <w:rPr>
-                <w:rFonts w:ascii="Sakkal Majalla" w:hAnsi="Sakkal Majalla" w:cs="Sakkal Majalla" w:hint="cs"/>
-                <w:color w:val="000000"/>
-                <w:sz w:val="28"/>
-                <w:szCs w:val="28"/>
-                <w:rtl/>
-              </w:rPr>
-              <w:t>إنتاج</w:t>
-            </w:r>
-            <w:r>
-              <w:rPr>
-                <w:rFonts w:ascii="Sakkal Majalla" w:hAnsi="Sakkal Majalla" w:cs="Sakkal Majalla"/>
-                <w:color w:val="000000"/>
-                <w:sz w:val="28"/>
-                <w:szCs w:val="28"/>
-                <w:rtl/>
-              </w:rPr>
-              <w:t xml:space="preserve"> </w:t>
-            </w:r>
-            <w:r>
-              <w:rPr>
-                <w:rFonts w:ascii="Sakkal Majalla" w:hAnsi="Sakkal Majalla" w:cs="Sakkal Majalla" w:hint="cs"/>
-                <w:color w:val="000000"/>
-                <w:sz w:val="28"/>
-                <w:szCs w:val="28"/>
-                <w:rtl/>
-              </w:rPr>
-              <w:t>المعرفة</w:t>
-            </w:r>
-            <w:r>
-              <w:rPr>
-                <w:rFonts w:ascii="Sakkal Majalla" w:hAnsi="Sakkal Majalla" w:cs="Sakkal Majalla"/>
-                <w:color w:val="000000"/>
-                <w:sz w:val="28"/>
-                <w:szCs w:val="28"/>
-                <w:rtl/>
-              </w:rPr>
-              <w:t xml:space="preserve"> </w:t>
-            </w:r>
-            <w:r>
-              <w:rPr>
-                <w:rFonts w:ascii="Sakkal Majalla" w:hAnsi="Sakkal Majalla" w:cs="Sakkal Majalla" w:hint="cs"/>
-                <w:color w:val="000000"/>
-                <w:sz w:val="28"/>
-                <w:szCs w:val="28"/>
-                <w:rtl/>
-              </w:rPr>
-              <w:t>في</w:t>
-            </w:r>
-            <w:r>
-              <w:rPr>
-                <w:rFonts w:ascii="Sakkal Majalla" w:hAnsi="Sakkal Majalla" w:cs="Sakkal Majalla"/>
-                <w:color w:val="000000"/>
-                <w:sz w:val="28"/>
-                <w:szCs w:val="28"/>
-                <w:rtl/>
-              </w:rPr>
-              <w:t xml:space="preserve"> </w:t>
-            </w:r>
-            <w:r>
-              <w:rPr>
-                <w:rFonts w:ascii="Sakkal Majalla" w:hAnsi="Sakkal Majalla" w:cs="Sakkal Majalla" w:hint="cs"/>
-                <w:color w:val="000000"/>
-                <w:sz w:val="28"/>
-                <w:szCs w:val="28"/>
-                <w:rtl/>
-              </w:rPr>
-              <w:t>هذا</w:t>
-            </w:r>
-            <w:r>
-              <w:rPr>
-                <w:rFonts w:ascii="Sakkal Majalla" w:hAnsi="Sakkal Majalla" w:cs="Sakkal Majalla"/>
-                <w:color w:val="000000"/>
-                <w:sz w:val="28"/>
-                <w:szCs w:val="28"/>
-                <w:rtl/>
-              </w:rPr>
-              <w:t xml:space="preserve"> </w:t>
-            </w:r>
-            <w:r>
-              <w:rPr>
-                <w:rFonts w:ascii="Sakkal Majalla" w:hAnsi="Sakkal Majalla" w:cs="Sakkal Majalla" w:hint="cs"/>
-                <w:color w:val="000000"/>
-                <w:sz w:val="28"/>
-                <w:szCs w:val="28"/>
-                <w:rtl/>
-              </w:rPr>
-              <w:t>الكتاب</w:t>
-            </w:r>
-            <w:r>
-              <w:rPr>
-                <w:rFonts w:ascii="Sakkal Majalla" w:hAnsi="Sakkal Majalla" w:cs="Sakkal Majalla"/>
-                <w:color w:val="000000"/>
-                <w:sz w:val="28"/>
-                <w:szCs w:val="28"/>
-                <w:rtl/>
-              </w:rPr>
-              <w:t xml:space="preserve"> </w:t>
-            </w:r>
-            <w:r>
-              <w:rPr>
-                <w:rFonts w:ascii="Sakkal Majalla" w:hAnsi="Sakkal Majalla" w:cs="Sakkal Majalla" w:hint="cs"/>
-                <w:color w:val="000000"/>
-                <w:sz w:val="28"/>
-                <w:szCs w:val="28"/>
-                <w:rtl/>
-              </w:rPr>
-              <w:t>—</w:t>
-            </w:r>
-            <w:r>
-              <w:rPr>
-                <w:rFonts w:ascii="Sakkal Majalla" w:hAnsi="Sakkal Majalla" w:cs="Sakkal Majalla"/>
-                <w:color w:val="000000"/>
-                <w:sz w:val="28"/>
-                <w:szCs w:val="28"/>
-                <w:rtl/>
-              </w:rPr>
-              <w:t xml:space="preserve"> </w:t>
-            </w:r>
-            <w:r>
-              <w:rPr>
-                <w:rFonts w:ascii="Sakkal Majalla" w:hAnsi="Sakkal Majalla" w:cs="Sakkal Majalla" w:hint="cs"/>
-                <w:color w:val="000000"/>
-                <w:sz w:val="28"/>
-                <w:szCs w:val="28"/>
-                <w:rtl/>
-              </w:rPr>
-              <w:t>ليس</w:t>
-            </w:r>
-            <w:r>
-              <w:rPr>
-                <w:rFonts w:ascii="Sakkal Majalla" w:hAnsi="Sakkal Majalla" w:cs="Sakkal Majalla"/>
-                <w:color w:val="000000"/>
-                <w:sz w:val="28"/>
-                <w:szCs w:val="28"/>
-                <w:rtl/>
-              </w:rPr>
-              <w:t xml:space="preserve"> </w:t>
-            </w:r>
-            <w:r>
-              <w:rPr>
-                <w:rFonts w:ascii="Sakkal Majalla" w:hAnsi="Sakkal Majalla" w:cs="Sakkal Majalla" w:hint="cs"/>
-                <w:color w:val="000000"/>
-                <w:sz w:val="28"/>
-                <w:szCs w:val="28"/>
-                <w:rtl/>
-              </w:rPr>
-              <w:t>قائمةً</w:t>
-            </w:r>
-            <w:r>
-              <w:rPr>
-                <w:rFonts w:ascii="Sakkal Majalla" w:hAnsi="Sakkal Majalla" w:cs="Sakkal Majalla"/>
-                <w:color w:val="000000"/>
-                <w:sz w:val="28"/>
-                <w:szCs w:val="28"/>
-                <w:rtl/>
-              </w:rPr>
-              <w:t xml:space="preserve"> </w:t>
-            </w:r>
-            <w:r>
-              <w:rPr>
-                <w:rFonts w:ascii="Sakkal Majalla" w:hAnsi="Sakkal Majalla" w:cs="Sakkal Majalla" w:hint="cs"/>
-                <w:color w:val="000000"/>
-                <w:sz w:val="28"/>
-                <w:szCs w:val="28"/>
-                <w:rtl/>
-              </w:rPr>
-              <w:t>بالمعلومات،</w:t>
-            </w:r>
-            <w:r>
-              <w:rPr>
-                <w:rFonts w:ascii="Sakkal Majalla" w:hAnsi="Sakkal Majalla" w:cs="Sakkal Majalla"/>
-                <w:color w:val="000000"/>
-                <w:sz w:val="28"/>
-                <w:szCs w:val="28"/>
-                <w:rtl/>
-              </w:rPr>
-              <w:t xml:space="preserve"> </w:t>
-            </w:r>
-            <w:r>
-              <w:rPr>
-                <w:rFonts w:ascii="Sakkal Majalla" w:hAnsi="Sakkal Majalla" w:cs="Sakkal Majalla" w:hint="cs"/>
-                <w:color w:val="000000"/>
-                <w:sz w:val="28"/>
-                <w:szCs w:val="28"/>
-                <w:rtl/>
-              </w:rPr>
-              <w:t>بل</w:t>
-            </w:r>
-            <w:r>
-              <w:rPr>
-                <w:rFonts w:ascii="Sakkal Majalla" w:hAnsi="Sakkal Majalla" w:cs="Sakkal Majalla"/>
-                <w:color w:val="000000"/>
-                <w:sz w:val="28"/>
-                <w:szCs w:val="28"/>
-                <w:rtl/>
-              </w:rPr>
-              <w:t xml:space="preserve"> </w:t>
-            </w:r>
-            <w:r>
-              <w:rPr>
-                <w:rFonts w:ascii="Sakkal Majalla" w:hAnsi="Sakkal Majalla" w:cs="Sakkal Majalla" w:hint="cs"/>
-                <w:color w:val="000000"/>
-                <w:sz w:val="28"/>
-                <w:szCs w:val="28"/>
-                <w:rtl/>
-              </w:rPr>
-              <w:t>منهجاً</w:t>
-            </w:r>
-            <w:r>
-              <w:rPr>
-                <w:rFonts w:ascii="Sakkal Majalla" w:hAnsi="Sakkal Majalla" w:cs="Sakkal Majalla"/>
-                <w:color w:val="000000"/>
-                <w:sz w:val="28"/>
-                <w:szCs w:val="28"/>
-                <w:rtl/>
-              </w:rPr>
-              <w:t xml:space="preserve"> </w:t>
-            </w:r>
-            <w:r>
-              <w:rPr>
-                <w:rFonts w:ascii="Sakkal Majalla" w:hAnsi="Sakkal Majalla" w:cs="Sakkal Majalla" w:hint="cs"/>
-                <w:color w:val="000000"/>
-                <w:sz w:val="28"/>
-                <w:szCs w:val="28"/>
-                <w:rtl/>
-              </w:rPr>
-              <w:t>لبنائها</w:t>
-            </w:r>
-            <w:r>
-              <w:rPr>
-                <w:rFonts w:ascii="Sakkal Majalla" w:hAnsi="Sakkal Majalla" w:cs="Sakkal Majalla"/>
-                <w:color w:val="000000"/>
-                <w:sz w:val="28"/>
-                <w:szCs w:val="28"/>
-                <w:rtl/>
-              </w:rPr>
-              <w:t xml:space="preserve">.  </w:t>
-            </w:r>
-            <w:r>
-              <w:rPr>
-                <w:rFonts w:hint="cs"/>
-                <w:color w:val="000000"/>
-                <w:sz w:val="28"/>
-                <w:szCs w:val="28"/>
-                <w:rtl/>
-              </w:rPr>
-              <w:t>→</w:t>
-            </w:r>
-            <w:r>
-              <w:rPr>
-                <w:rFonts w:ascii="Sakkal Majalla" w:hAnsi="Sakkal Majalla" w:cs="Sakkal Majalla"/>
-                <w:color w:val="000000"/>
-                <w:sz w:val="28"/>
-                <w:szCs w:val="28"/>
-                <w:rtl/>
-              </w:rPr>
-              <w:t xml:space="preserve">  </w:t>
-            </w:r>
-            <w:r>
-              <w:rPr>
-                <w:rFonts w:ascii="Sakkal Majalla" w:hAnsi="Sakkal Majalla" w:cs="Sakkal Majalla" w:hint="cs"/>
-                <w:color w:val="000000"/>
-                <w:sz w:val="28"/>
-                <w:szCs w:val="28"/>
-                <w:rtl/>
-              </w:rPr>
-              <w:t>المثال</w:t>
-            </w:r>
-            <w:r>
-              <w:rPr>
-                <w:rFonts w:ascii="Sakkal Majalla" w:hAnsi="Sakkal Majalla" w:cs="Sakkal Majalla"/>
-                <w:color w:val="000000"/>
-                <w:sz w:val="28"/>
-                <w:szCs w:val="28"/>
-                <w:rtl/>
-              </w:rPr>
-              <w:t xml:space="preserve"> </w:t>
-            </w:r>
-            <w:r>
-              <w:rPr>
-                <w:rFonts w:ascii="Sakkal Majalla" w:hAnsi="Sakkal Majalla" w:cs="Sakkal Majalla" w:hint="cs"/>
-                <w:color w:val="000000"/>
-                <w:sz w:val="28"/>
-                <w:szCs w:val="28"/>
-                <w:rtl/>
-              </w:rPr>
-              <w:t>الإداري</w:t>
-            </w:r>
-            <w:r>
-              <w:rPr>
-                <w:rFonts w:ascii="Sakkal Majalla" w:hAnsi="Sakkal Majalla" w:cs="Sakkal Majalla"/>
-                <w:color w:val="000000"/>
-                <w:sz w:val="28"/>
-                <w:szCs w:val="28"/>
-                <w:rtl/>
-              </w:rPr>
-              <w:t xml:space="preserve">: </w:t>
-            </w:r>
-            <w:r>
-              <w:rPr>
-                <w:rFonts w:ascii="Sakkal Majalla" w:hAnsi="Sakkal Majalla" w:cs="Sakkal Majalla" w:hint="cs"/>
-                <w:color w:val="000000"/>
-                <w:sz w:val="28"/>
-                <w:szCs w:val="28"/>
-                <w:rtl/>
-              </w:rPr>
-              <w:t>حين</w:t>
-            </w:r>
-            <w:r>
-              <w:rPr>
-                <w:rFonts w:ascii="Sakkal Majalla" w:hAnsi="Sakkal Majalla" w:cs="Sakkal Majalla"/>
-                <w:color w:val="000000"/>
-                <w:sz w:val="28"/>
-                <w:szCs w:val="28"/>
-                <w:rtl/>
-              </w:rPr>
-              <w:t xml:space="preserve"> </w:t>
-            </w:r>
-            <w:r>
-              <w:rPr>
-                <w:rFonts w:ascii="Sakkal Majalla" w:hAnsi="Sakkal Majalla" w:cs="Sakkal Majalla" w:hint="cs"/>
-                <w:color w:val="000000"/>
-                <w:sz w:val="28"/>
-                <w:szCs w:val="28"/>
-                <w:rtl/>
-              </w:rPr>
-              <w:t>تقول</w:t>
-            </w:r>
-            <w:r>
-              <w:rPr>
-                <w:rFonts w:ascii="Sakkal Majalla" w:hAnsi="Sakkal Majalla" w:cs="Sakkal Majalla"/>
-                <w:color w:val="000000"/>
-                <w:sz w:val="28"/>
-                <w:szCs w:val="28"/>
-                <w:rtl/>
-              </w:rPr>
-              <w:t xml:space="preserve"> </w:t>
-            </w:r>
-            <w:r>
-              <w:rPr>
-                <w:rFonts w:ascii="Sakkal Majalla" w:hAnsi="Sakkal Majalla" w:cs="Sakkal Majalla" w:hint="cs"/>
-                <w:color w:val="000000"/>
-                <w:sz w:val="28"/>
-                <w:szCs w:val="28"/>
-                <w:rtl/>
-              </w:rPr>
-              <w:t>شركة</w:t>
-            </w:r>
-            <w:r>
-              <w:rPr>
-                <w:rFonts w:ascii="Sakkal Majalla" w:hAnsi="Sakkal Majalla" w:cs="Sakkal Majalla"/>
-                <w:color w:val="000000"/>
-                <w:sz w:val="28"/>
-                <w:szCs w:val="28"/>
-                <w:rtl/>
-              </w:rPr>
-              <w:t xml:space="preserve"> "</w:t>
-            </w:r>
-            <w:r>
-              <w:rPr>
-                <w:rFonts w:ascii="Sakkal Majalla" w:hAnsi="Sakkal Majalla" w:cs="Sakkal Majalla" w:hint="cs"/>
-                <w:color w:val="000000"/>
-                <w:sz w:val="28"/>
-                <w:szCs w:val="28"/>
-                <w:rtl/>
-              </w:rPr>
-              <w:t>نحن</w:t>
-            </w:r>
-            <w:r>
-              <w:rPr>
-                <w:rFonts w:ascii="Sakkal Majalla" w:hAnsi="Sakkal Majalla" w:cs="Sakkal Majalla"/>
-                <w:color w:val="000000"/>
-                <w:sz w:val="28"/>
-                <w:szCs w:val="28"/>
-                <w:rtl/>
-              </w:rPr>
-              <w:t xml:space="preserve"> </w:t>
-            </w:r>
-            <w:r>
-              <w:rPr>
-                <w:rFonts w:ascii="Sakkal Majalla" w:hAnsi="Sakkal Majalla" w:cs="Sakkal Majalla" w:hint="cs"/>
-                <w:color w:val="000000"/>
-                <w:sz w:val="28"/>
-                <w:szCs w:val="28"/>
-                <w:rtl/>
-              </w:rPr>
-              <w:t>نُقرِّر</w:t>
-            </w:r>
-            <w:r>
-              <w:rPr>
-                <w:rFonts w:ascii="Sakkal Majalla" w:hAnsi="Sakkal Majalla" w:cs="Sakkal Majalla"/>
-                <w:color w:val="000000"/>
-                <w:sz w:val="28"/>
-                <w:szCs w:val="28"/>
-                <w:rtl/>
-              </w:rPr>
-              <w:t xml:space="preserve"> </w:t>
-            </w:r>
-            <w:r>
-              <w:rPr>
-                <w:rFonts w:ascii="Sakkal Majalla" w:hAnsi="Sakkal Majalla" w:cs="Sakkal Majalla" w:hint="cs"/>
-                <w:color w:val="000000"/>
-                <w:sz w:val="28"/>
-                <w:szCs w:val="28"/>
-                <w:rtl/>
-              </w:rPr>
-              <w:t>بالبيانات</w:t>
-            </w:r>
-            <w:r>
-              <w:rPr>
-                <w:rFonts w:ascii="Sakkal Majalla" w:hAnsi="Sakkal Majalla" w:cs="Sakkal Majalla"/>
-                <w:color w:val="000000"/>
-                <w:sz w:val="28"/>
-                <w:szCs w:val="28"/>
-                <w:rtl/>
-              </w:rPr>
-              <w:t xml:space="preserve">" </w:t>
-            </w:r>
-            <w:r>
-              <w:rPr>
-                <w:rFonts w:ascii="Sakkal Majalla" w:hAnsi="Sakkal Majalla" w:cs="Sakkal Majalla" w:hint="cs"/>
-                <w:color w:val="000000"/>
-                <w:sz w:val="28"/>
-                <w:szCs w:val="28"/>
-                <w:rtl/>
-              </w:rPr>
-              <w:t>—</w:t>
-            </w:r>
-            <w:r>
-              <w:rPr>
-                <w:rFonts w:ascii="Sakkal Majalla" w:hAnsi="Sakkal Majalla" w:cs="Sakkal Majalla"/>
-                <w:color w:val="000000"/>
-                <w:sz w:val="28"/>
-                <w:szCs w:val="28"/>
-                <w:rtl/>
-              </w:rPr>
-              <w:t xml:space="preserve"> </w:t>
-            </w:r>
-            <w:r>
-              <w:rPr>
-                <w:rFonts w:ascii="Sakkal Majalla" w:hAnsi="Sakkal Majalla" w:cs="Sakkal Majalla" w:hint="cs"/>
-                <w:color w:val="000000"/>
-                <w:sz w:val="28"/>
-                <w:szCs w:val="28"/>
-                <w:rtl/>
-              </w:rPr>
-              <w:t>هذا</w:t>
-            </w:r>
-            <w:r>
-              <w:rPr>
-                <w:rFonts w:ascii="Sakkal Majalla" w:hAnsi="Sakkal Majalla" w:cs="Sakkal Majalla"/>
-                <w:color w:val="000000"/>
-                <w:sz w:val="28"/>
-                <w:szCs w:val="28"/>
-                <w:rtl/>
-              </w:rPr>
-              <w:t xml:space="preserve"> </w:t>
-            </w:r>
-            <w:r>
-              <w:rPr>
-                <w:rFonts w:ascii="Sakkal Majalla" w:hAnsi="Sakkal Majalla" w:cs="Sakkal Majalla" w:hint="cs"/>
-                <w:color w:val="000000"/>
-                <w:sz w:val="28"/>
-                <w:szCs w:val="28"/>
-                <w:rtl/>
-              </w:rPr>
-              <w:t>إطارها</w:t>
-            </w:r>
-            <w:r>
-              <w:rPr>
-                <w:rFonts w:ascii="Sakkal Majalla" w:hAnsi="Sakkal Majalla" w:cs="Sakkal Majalla"/>
-                <w:color w:val="000000"/>
-                <w:sz w:val="28"/>
-                <w:szCs w:val="28"/>
-                <w:rtl/>
-              </w:rPr>
-              <w:t xml:space="preserve"> </w:t>
-            </w:r>
-            <w:r>
-              <w:rPr>
-                <w:rFonts w:ascii="Sakkal Majalla" w:hAnsi="Sakkal Majalla" w:cs="Sakkal Majalla" w:hint="cs"/>
-                <w:color w:val="000000"/>
-                <w:sz w:val="28"/>
-                <w:szCs w:val="28"/>
-                <w:rtl/>
-              </w:rPr>
-              <w:t>الابستيمولوجي</w:t>
-            </w:r>
-            <w:r>
-              <w:rPr>
-                <w:rFonts w:ascii="Sakkal Majalla" w:hAnsi="Sakkal Majalla" w:cs="Sakkal Majalla"/>
-                <w:color w:val="000000"/>
-                <w:sz w:val="28"/>
-                <w:szCs w:val="28"/>
-                <w:rtl/>
-              </w:rPr>
-              <w:t xml:space="preserve"> (</w:t>
-            </w:r>
-            <w:r>
-              <w:rPr>
-                <w:rFonts w:ascii="Sakkal Majalla" w:hAnsi="Sakkal Majalla" w:cs="Sakkal Majalla" w:hint="cs"/>
-                <w:color w:val="000000"/>
-                <w:sz w:val="28"/>
-                <w:szCs w:val="28"/>
-                <w:rtl/>
-              </w:rPr>
-              <w:t>الثقة</w:t>
-            </w:r>
-            <w:r>
-              <w:rPr>
-                <w:rFonts w:ascii="Sakkal Majalla" w:hAnsi="Sakkal Majalla" w:cs="Sakkal Majalla"/>
-                <w:color w:val="000000"/>
-                <w:sz w:val="28"/>
-                <w:szCs w:val="28"/>
-                <w:rtl/>
-              </w:rPr>
-              <w:t xml:space="preserve"> </w:t>
-            </w:r>
-            <w:r>
-              <w:rPr>
-                <w:rFonts w:ascii="Sakkal Majalla" w:hAnsi="Sakkal Majalla" w:cs="Sakkal Majalla" w:hint="cs"/>
-                <w:color w:val="000000"/>
-                <w:sz w:val="28"/>
-                <w:szCs w:val="28"/>
-                <w:rtl/>
-              </w:rPr>
-              <w:t>بالتجربة</w:t>
-            </w:r>
-            <w:r>
-              <w:rPr>
-                <w:rFonts w:ascii="Sakkal Majalla" w:hAnsi="Sakkal Majalla" w:cs="Sakkal Majalla"/>
-                <w:color w:val="000000"/>
-                <w:sz w:val="28"/>
-                <w:szCs w:val="28"/>
-                <w:rtl/>
-              </w:rPr>
-              <w:t xml:space="preserve"> </w:t>
-            </w:r>
-            <w:r>
-              <w:rPr>
-                <w:rFonts w:ascii="Sakkal Majalla" w:hAnsi="Sakkal Majalla" w:cs="Sakkal Majalla" w:hint="cs"/>
-                <w:color w:val="000000"/>
-                <w:sz w:val="28"/>
-                <w:szCs w:val="28"/>
-                <w:rtl/>
-              </w:rPr>
-              <w:t>المقيسة</w:t>
-            </w:r>
-            <w:r>
-              <w:rPr>
-                <w:rFonts w:ascii="Sakkal Majalla" w:hAnsi="Sakkal Majalla" w:cs="Sakkal Majalla"/>
-                <w:color w:val="000000"/>
-                <w:sz w:val="28"/>
-                <w:szCs w:val="28"/>
-                <w:rtl/>
-              </w:rPr>
-              <w:t xml:space="preserve">). </w:t>
-            </w:r>
-            <w:r>
-              <w:rPr>
-                <w:rFonts w:ascii="Sakkal Majalla" w:hAnsi="Sakkal Majalla" w:cs="Sakkal Majalla" w:hint="cs"/>
-                <w:color w:val="000000"/>
-                <w:sz w:val="28"/>
-                <w:szCs w:val="28"/>
-                <w:rtl/>
-              </w:rPr>
-              <w:t>حين</w:t>
-            </w:r>
-            <w:r>
-              <w:rPr>
-                <w:rFonts w:ascii="Sakkal Majalla" w:hAnsi="Sakkal Majalla" w:cs="Sakkal Majalla"/>
-                <w:color w:val="000000"/>
-                <w:sz w:val="28"/>
-                <w:szCs w:val="28"/>
-                <w:rtl/>
-              </w:rPr>
-              <w:t xml:space="preserve"> </w:t>
-            </w:r>
-            <w:r>
-              <w:rPr>
-                <w:rFonts w:ascii="Sakkal Majalla" w:hAnsi="Sakkal Majalla" w:cs="Sakkal Majalla" w:hint="cs"/>
-                <w:color w:val="000000"/>
-                <w:sz w:val="28"/>
-                <w:szCs w:val="28"/>
-                <w:rtl/>
-              </w:rPr>
-              <w:t>تقول</w:t>
-            </w:r>
-            <w:r>
-              <w:rPr>
-                <w:rFonts w:ascii="Sakkal Majalla" w:hAnsi="Sakkal Majalla" w:cs="Sakkal Majalla"/>
-                <w:color w:val="000000"/>
-                <w:sz w:val="28"/>
-                <w:szCs w:val="28"/>
-                <w:rtl/>
-              </w:rPr>
-              <w:t xml:space="preserve"> "</w:t>
-            </w:r>
-            <w:r>
-              <w:rPr>
-                <w:rFonts w:ascii="Sakkal Majalla" w:hAnsi="Sakkal Majalla" w:cs="Sakkal Majalla" w:hint="cs"/>
-                <w:color w:val="000000"/>
-                <w:sz w:val="28"/>
-                <w:szCs w:val="28"/>
-                <w:rtl/>
-              </w:rPr>
-              <w:t>نُقرِّر</w:t>
-            </w:r>
-            <w:r>
-              <w:rPr>
-                <w:rFonts w:ascii="Sakkal Majalla" w:hAnsi="Sakkal Majalla" w:cs="Sakkal Majalla"/>
-                <w:color w:val="000000"/>
-                <w:sz w:val="28"/>
-                <w:szCs w:val="28"/>
-                <w:rtl/>
-              </w:rPr>
-              <w:t xml:space="preserve"> </w:t>
-            </w:r>
-            <w:r>
-              <w:rPr>
-                <w:rFonts w:ascii="Sakkal Majalla" w:hAnsi="Sakkal Majalla" w:cs="Sakkal Majalla" w:hint="cs"/>
-                <w:color w:val="000000"/>
-                <w:sz w:val="28"/>
-                <w:szCs w:val="28"/>
-                <w:rtl/>
-              </w:rPr>
-              <w:t>بخبرة</w:t>
-            </w:r>
-            <w:r>
-              <w:rPr>
-                <w:rFonts w:ascii="Sakkal Majalla" w:hAnsi="Sakkal Majalla" w:cs="Sakkal Majalla"/>
-                <w:color w:val="000000"/>
-                <w:sz w:val="28"/>
-                <w:szCs w:val="28"/>
-                <w:rtl/>
-              </w:rPr>
-              <w:t xml:space="preserve"> </w:t>
-            </w:r>
-            <w:r>
-              <w:rPr>
-                <w:rFonts w:ascii="Sakkal Majalla" w:hAnsi="Sakkal Majalla" w:cs="Sakkal Majalla" w:hint="cs"/>
-                <w:color w:val="000000"/>
-                <w:sz w:val="28"/>
-                <w:szCs w:val="28"/>
-                <w:rtl/>
-              </w:rPr>
-              <w:t>القيادة</w:t>
-            </w:r>
-            <w:r>
-              <w:rPr>
-                <w:rFonts w:ascii="Sakkal Majalla" w:hAnsi="Sakkal Majalla" w:cs="Sakkal Majalla"/>
-                <w:color w:val="000000"/>
-                <w:sz w:val="28"/>
-                <w:szCs w:val="28"/>
-                <w:rtl/>
-              </w:rPr>
-              <w:t xml:space="preserve">" </w:t>
-            </w:r>
-            <w:r>
-              <w:rPr>
-                <w:rFonts w:ascii="Sakkal Majalla" w:hAnsi="Sakkal Majalla" w:cs="Sakkal Majalla" w:hint="cs"/>
-                <w:color w:val="000000"/>
-                <w:sz w:val="28"/>
-                <w:szCs w:val="28"/>
-                <w:rtl/>
-              </w:rPr>
-              <w:t>—</w:t>
-            </w:r>
-            <w:r>
-              <w:rPr>
-                <w:rFonts w:ascii="Sakkal Majalla" w:hAnsi="Sakkal Majalla" w:cs="Sakkal Majalla"/>
-                <w:color w:val="000000"/>
-                <w:sz w:val="28"/>
-                <w:szCs w:val="28"/>
-                <w:rtl/>
-              </w:rPr>
-              <w:t xml:space="preserve"> </w:t>
-            </w:r>
-            <w:r>
-              <w:rPr>
-                <w:rFonts w:ascii="Sakkal Majalla" w:hAnsi="Sakkal Majalla" w:cs="Sakkal Majalla" w:hint="cs"/>
-                <w:color w:val="000000"/>
-                <w:sz w:val="28"/>
-                <w:szCs w:val="28"/>
-                <w:rtl/>
-              </w:rPr>
-              <w:t>هذا</w:t>
-            </w:r>
-            <w:r>
-              <w:rPr>
-                <w:rFonts w:ascii="Sakkal Majalla" w:hAnsi="Sakkal Majalla" w:cs="Sakkal Majalla"/>
-                <w:color w:val="000000"/>
-                <w:sz w:val="28"/>
-                <w:szCs w:val="28"/>
-                <w:rtl/>
-              </w:rPr>
-              <w:t xml:space="preserve"> </w:t>
-            </w:r>
-            <w:r>
-              <w:rPr>
-                <w:rFonts w:ascii="Sakkal Majalla" w:hAnsi="Sakkal Majalla" w:cs="Sakkal Majalla" w:hint="cs"/>
-                <w:color w:val="000000"/>
-                <w:sz w:val="28"/>
-                <w:szCs w:val="28"/>
-                <w:rtl/>
-              </w:rPr>
-              <w:t>إطار</w:t>
-            </w:r>
-            <w:r>
-              <w:rPr>
-                <w:rFonts w:ascii="Sakkal Majalla" w:hAnsi="Sakkal Majalla" w:cs="Sakkal Majalla"/>
-                <w:color w:val="000000"/>
-                <w:sz w:val="28"/>
-                <w:szCs w:val="28"/>
-                <w:rtl/>
-              </w:rPr>
-              <w:t xml:space="preserve"> </w:t>
-            </w:r>
-            <w:r>
-              <w:rPr>
-                <w:rFonts w:ascii="Sakkal Majalla" w:hAnsi="Sakkal Majalla" w:cs="Sakkal Majalla" w:hint="cs"/>
-                <w:color w:val="000000"/>
-                <w:sz w:val="28"/>
-                <w:szCs w:val="28"/>
-                <w:rtl/>
-              </w:rPr>
-              <w:t>آخر</w:t>
-            </w:r>
-            <w:r>
-              <w:rPr>
-                <w:rFonts w:ascii="Sakkal Majalla" w:hAnsi="Sakkal Majalla" w:cs="Sakkal Majalla"/>
-                <w:color w:val="000000"/>
-                <w:sz w:val="28"/>
-                <w:szCs w:val="28"/>
-                <w:rtl/>
-              </w:rPr>
-              <w:t xml:space="preserve">. </w:t>
-            </w:r>
-            <w:r>
-              <w:rPr>
-                <w:rFonts w:ascii="Sakkal Majalla" w:hAnsi="Sakkal Majalla" w:cs="Sakkal Majalla" w:hint="cs"/>
-                <w:color w:val="000000"/>
-                <w:sz w:val="28"/>
-                <w:szCs w:val="28"/>
-                <w:rtl/>
-              </w:rPr>
-              <w:t>هذا</w:t>
-            </w:r>
-            <w:r>
-              <w:rPr>
-                <w:rFonts w:ascii="Sakkal Majalla" w:hAnsi="Sakkal Majalla" w:cs="Sakkal Majalla"/>
-                <w:color w:val="000000"/>
-                <w:sz w:val="28"/>
-                <w:szCs w:val="28"/>
-                <w:rtl/>
-              </w:rPr>
-              <w:t xml:space="preserve"> </w:t>
-            </w:r>
-            <w:r>
-              <w:rPr>
-                <w:rFonts w:ascii="Sakkal Majalla" w:hAnsi="Sakkal Majalla" w:cs="Sakkal Majalla" w:hint="cs"/>
-                <w:color w:val="000000"/>
-                <w:sz w:val="28"/>
-                <w:szCs w:val="28"/>
-                <w:rtl/>
-              </w:rPr>
-              <w:t>الكتاب</w:t>
-            </w:r>
-            <w:r>
-              <w:rPr>
-                <w:rFonts w:ascii="Sakkal Majalla" w:hAnsi="Sakkal Majalla" w:cs="Sakkal Majalla"/>
-                <w:color w:val="000000"/>
-                <w:sz w:val="28"/>
-                <w:szCs w:val="28"/>
-                <w:rtl/>
-              </w:rPr>
-              <w:t xml:space="preserve"> </w:t>
-            </w:r>
-            <w:r>
-              <w:rPr>
-                <w:rFonts w:ascii="Sakkal Majalla" w:hAnsi="Sakkal Majalla" w:cs="Sakkal Majalla" w:hint="cs"/>
-                <w:color w:val="000000"/>
-                <w:sz w:val="28"/>
-                <w:szCs w:val="28"/>
-                <w:rtl/>
-              </w:rPr>
-              <w:t>يقول</w:t>
-            </w:r>
-            <w:r>
-              <w:rPr>
-                <w:rFonts w:ascii="Sakkal Majalla" w:hAnsi="Sakkal Majalla" w:cs="Sakkal Majalla"/>
-                <w:color w:val="000000"/>
-                <w:sz w:val="28"/>
-                <w:szCs w:val="28"/>
-                <w:rtl/>
-              </w:rPr>
-              <w:t>: "</w:t>
-            </w:r>
-            <w:r>
-              <w:rPr>
-                <w:rFonts w:ascii="Sakkal Majalla" w:hAnsi="Sakkal Majalla" w:cs="Sakkal Majalla" w:hint="cs"/>
-                <w:color w:val="000000"/>
-                <w:sz w:val="28"/>
-                <w:szCs w:val="28"/>
-                <w:rtl/>
-              </w:rPr>
-              <w:t>نُقرِّر</w:t>
-            </w:r>
-            <w:r>
-              <w:rPr>
-                <w:rFonts w:ascii="Sakkal Majalla" w:hAnsi="Sakkal Majalla" w:cs="Sakkal Majalla"/>
-                <w:color w:val="000000"/>
-                <w:sz w:val="28"/>
-                <w:szCs w:val="28"/>
-                <w:rtl/>
-              </w:rPr>
-              <w:t xml:space="preserve"> </w:t>
-            </w:r>
-            <w:r>
-              <w:rPr>
-                <w:rFonts w:ascii="Sakkal Majalla" w:hAnsi="Sakkal Majalla" w:cs="Sakkal Majalla" w:hint="cs"/>
-                <w:color w:val="000000"/>
-                <w:sz w:val="28"/>
-                <w:szCs w:val="28"/>
-                <w:rtl/>
-              </w:rPr>
-              <w:t>بالوحي</w:t>
-            </w:r>
-            <w:r>
-              <w:rPr>
-                <w:rFonts w:ascii="Sakkal Majalla" w:hAnsi="Sakkal Majalla" w:cs="Sakkal Majalla"/>
-                <w:color w:val="000000"/>
-                <w:sz w:val="28"/>
-                <w:szCs w:val="28"/>
-                <w:rtl/>
-              </w:rPr>
-              <w:t xml:space="preserve"> + </w:t>
-            </w:r>
-            <w:r>
-              <w:rPr>
-                <w:rFonts w:ascii="Sakkal Majalla" w:hAnsi="Sakkal Majalla" w:cs="Sakkal Majalla" w:hint="cs"/>
-                <w:color w:val="000000"/>
-                <w:sz w:val="28"/>
-                <w:szCs w:val="28"/>
-                <w:rtl/>
-              </w:rPr>
-              <w:t>العقل</w:t>
-            </w:r>
-            <w:r>
-              <w:rPr>
-                <w:rFonts w:ascii="Sakkal Majalla" w:hAnsi="Sakkal Majalla" w:cs="Sakkal Majalla"/>
-                <w:color w:val="000000"/>
-                <w:sz w:val="28"/>
-                <w:szCs w:val="28"/>
-                <w:rtl/>
-              </w:rPr>
-              <w:t xml:space="preserve"> + </w:t>
-            </w:r>
-            <w:r>
-              <w:rPr>
-                <w:rFonts w:ascii="Sakkal Majalla" w:hAnsi="Sakkal Majalla" w:cs="Sakkal Majalla" w:hint="cs"/>
-                <w:color w:val="000000"/>
-                <w:sz w:val="28"/>
-                <w:szCs w:val="28"/>
-                <w:rtl/>
-              </w:rPr>
-              <w:t>التجربة</w:t>
-            </w:r>
-            <w:r>
-              <w:rPr>
-                <w:rFonts w:ascii="Sakkal Majalla" w:hAnsi="Sakkal Majalla" w:cs="Sakkal Majalla"/>
-                <w:color w:val="000000"/>
-                <w:sz w:val="28"/>
-                <w:szCs w:val="28"/>
-                <w:rtl/>
-              </w:rPr>
-              <w:t xml:space="preserve"> </w:t>
-            </w:r>
-            <w:r>
-              <w:rPr>
-                <w:rFonts w:ascii="Sakkal Majalla" w:hAnsi="Sakkal Majalla" w:cs="Sakkal Majalla" w:hint="cs"/>
-                <w:color w:val="000000"/>
-                <w:sz w:val="28"/>
-                <w:szCs w:val="28"/>
-                <w:rtl/>
-              </w:rPr>
-              <w:t>—</w:t>
-            </w:r>
-            <w:r>
-              <w:rPr>
-                <w:rFonts w:ascii="Sakkal Majalla" w:hAnsi="Sakkal Majalla" w:cs="Sakkal Majalla"/>
-                <w:color w:val="000000"/>
-                <w:sz w:val="28"/>
-                <w:szCs w:val="28"/>
-                <w:rtl/>
-              </w:rPr>
-              <w:t xml:space="preserve"> </w:t>
-            </w:r>
-            <w:r>
-              <w:rPr>
-                <w:rFonts w:ascii="Sakkal Majalla" w:hAnsi="Sakkal Majalla" w:cs="Sakkal Majalla" w:hint="cs"/>
-                <w:color w:val="000000"/>
-                <w:sz w:val="28"/>
-                <w:szCs w:val="28"/>
-                <w:rtl/>
-              </w:rPr>
-              <w:t>بهذا</w:t>
-            </w:r>
-            <w:r>
-              <w:rPr>
-                <w:rFonts w:ascii="Sakkal Majalla" w:hAnsi="Sakkal Majalla" w:cs="Sakkal Majalla"/>
-                <w:color w:val="000000"/>
-                <w:sz w:val="28"/>
-                <w:szCs w:val="28"/>
-                <w:rtl/>
-              </w:rPr>
-              <w:t xml:space="preserve"> </w:t>
-            </w:r>
-            <w:r>
-              <w:rPr>
-                <w:rFonts w:ascii="Sakkal Majalla" w:hAnsi="Sakkal Majalla" w:cs="Sakkal Majalla" w:hint="cs"/>
-                <w:color w:val="000000"/>
-                <w:sz w:val="28"/>
-                <w:szCs w:val="28"/>
-                <w:rtl/>
-              </w:rPr>
-              <w:t>الترتيب</w:t>
-            </w:r>
-            <w:r>
-              <w:rPr>
-                <w:rFonts w:ascii="Sakkal Majalla" w:hAnsi="Sakkal Majalla" w:cs="Sakkal Majalla"/>
-                <w:color w:val="000000"/>
-                <w:sz w:val="28"/>
-                <w:szCs w:val="28"/>
-                <w:rtl/>
-              </w:rPr>
-              <w:t>."</w:t>
+              <w:t xml:space="preserve">الابستيمولوجيا (Epistemology) هي نظرية المعرفة، وتهتم بثلاثة أسئلة: من أين تأتي المعرفة؟ وما الذي نسلّم به دون اختبار، وما الذي نُخضعه للاختبار؟ وكيف نحكم بأن معرفةً ما صحيحة؟ والإطار الابستيمولوجي هو الجواب الذي يتبنّاه مشروعٌ ما عن هذه الأسئلة. وبلغة الإدارة: الشركة التي تقول «نقرّر بالبيانات» تُعلن إطارها المعرفي، وكذلك التي تقول «نقرّر بخبرة القيادة». أما هذا الكتاب فيقول: نقرّر بالوحي، ثم بالعقل، ثم بالتجربة، على هذا الترتيب.</w:t>
             </w:r>
           </w:p>
         </w:tc>
@@ -4516,7 +2232,7 @@
           <w:szCs w:val="28"/>
           <w:rtl/>
         </w:rPr>
-        <w:t>كل مشروع معرفي يبدأ بمسلَّمات لا يُثبتها من داخله — بل يُعلنها ويبني عليها. العلم التجريبي يُسلِّم بمبادئ المنطق والقابلية للقياس دون إثباتها تجريبيًا. ما يُميِّز المشروعَ العلميَّ من غيره ليس غياب المسلَّمات — بل وضوح الإعلان عنها وانضباط ما يُشتَق منها.</w:t>
+        <w:t xml:space="preserve">لا يبدأ مشروع معرفي من فراغ. كل مشروع يقوم على مسلّمات لا يستطيع إثباتها من داخله، فيُعلنها ويبني عليها. والعلم التجريبي نفسه يسلّم بمبادئ المنطق وبإمكان القياس دون أن يثبتها بالتجربة. فالذي يميّز العمل العلمي ليس خلوّه من المسلّمات، وإنما وضوحه في إعلانها وانضباطه فيما يشتقّه منها.</w:t>
       </w:r>
     </w:p>
     <w:p>
@@ -4540,7 +2256,7 @@
           <w:szCs w:val="28"/>
           <w:rtl/>
         </w:rPr>
-        <w:t>Thomas Kuhn, The Structure of Scientific Revolutions (1962): كل نموذج معرفي (paradigm) يعمل داخل مسلّمات لا يُناقشها — ويتغير حين تتراكم الشواذ إلى حد الأزمة.</w:t>
+        <w:t xml:space="preserve">Thomas Kuhn, The Structure of Scientific Revolutions (1962): يعمل كل نموذج معرفي (paradigm) داخل مسلّمات لا يناقشها، ولا يتغيّر إلا حين تتراكم الشواذ حتى تبلغ حدّ الأزمة.</w:t>
       </w:r>
     </w:p>
     <w:p>
@@ -4561,7 +2277,7 @@
           <w:szCs w:val="28"/>
           <w:rtl/>
         </w:rPr>
-        <w:t>يعمل هذا المشروع داخل إطار ابستيمولوجي إسلامي (Islamic Epistemological Framework — IEF) يُسلِّم بمسلَّمة أولى: صحة القرآن الكريم وأقوميته بوصفه وحيًا إلهيًا ودستورًا للإنسان. هذا الإعلان ليس اعتذارًا عن منهج مقصور — بل هو ضبط أمين للمُدَّعى.</w:t>
+        <w:t xml:space="preserve">ويعمل هذا الكتاب داخل إطار معرفي إسلامي (Islamic Epistemological Framework — IEF)، مسلّمته الأولى صحة القرآن الكريم وأقوميته بوصفه وحيًا إلهيًا ودستورًا للإنسان. ولا أرى في هذا الإعلان اعتذارًا عن منهج ضيّق؛ إنه تحديد أمين لما يدّعيه الكتاب وما لا يدّعيه.</w:t>
       </w:r>
     </w:p>
     <w:p>
@@ -4799,7 +2515,7 @@
                 <w:szCs w:val="28"/>
                 <w:rtl/>
               </w:rPr>
-              <w:t>النص القرآني حق — وصحته لا تُختبَر داخل هذا الإطار</w:t>
+              <w:t xml:space="preserve">النص القرآني حق، وصحته لا تُختبر داخل هذا الإطار</w:t>
             </w:r>
           </w:p>
         </w:tc>
@@ -4833,7 +2549,7 @@
                 <w:szCs w:val="28"/>
                 <w:rtl/>
               </w:rPr>
-              <w:t xml:space="preserve">لا يُسأل عن صحته، يُسأل عن فهمنا له. هذا تعيينٌ دقيق لما يُختبَر: الفهم البشري لا النص الإلهي. مثال: ﴿إِنَّ هَٰذَا الْقُرْآنَ يَهْدِي لِلَّتِي هِيَ أَقْوَمُ﴾.</w:t>
+              <w:t xml:space="preserve">لا نسأل عن صحته، بل عن فهمنا له؛ فالذي يُختبر هو الفهم البشري لا النص. مثال: ﴿إِنَّ هَٰذَا الْقُرْآنَ يَهْدِي لِلَّتِي هِيَ أَقْوَمُ﴾.</w:t>
             </w:r>
           </w:p>
         </w:tc>
@@ -4939,7 +2655,7 @@
                 <w:szCs w:val="28"/>
                 <w:rtl/>
               </w:rPr>
-              <w:t xml:space="preserve">اجتهاد بشري قابل للمراجعة والاختبار والنقض، وفيه تعمل الفرضية الصفرية (الفصل الثالث). كل ادعاء اشتقاقي في هذا الكتاب يقع في هذا المستوى. مثال: «الأمانة شرط السلطة لا ثمرتها».</w:t>
+              <w:t xml:space="preserve">اجتهاد بشري يقبل المراجعة والاختبار والنقض، وفيه تعمل الفرضية الصفرية (الفصل الثالث). وكل ادعاء اشتقاقي في الكتاب يقع هنا. مثال: «الأمانة شرطٌ للسلطة وليست ثمرةً لها».</w:t>
             </w:r>
           </w:p>
         </w:tc>
@@ -5046,7 +2762,7 @@
                 <w:szCs w:val="28"/>
                 <w:rtl/>
               </w:rPr>
-              <w:t xml:space="preserve">أداة للاختبار والتحقق — يُحاكَم بها المستوى الاجتهادي. لا تُحاكَم بالنص — بل يُحاكَم بها النموذج المشتق. مثال: دراسة ميدانية تقارن الثقة الداخلية بين مؤسسات تربط الترقية بسجل الأمانة وأخرى لا تفعل.</w:t>
+              <w:t xml:space="preserve">أداة نختبر بها الاجتهاد، لا النص. مثال: دراسة ميدانية تقارن الثقة الداخلية بين مؤسسات تربط الترقية بسجل الأمانة وأخرى لا تفعل.</w:t>
             </w:r>
           </w:p>
         </w:tc>
@@ -5128,7 +2844,7 @@
           <w:szCs w:val="28"/>
           <w:rtl/>
         </w:rPr>
-        <w:t>هذا التمييز جوهري ولا يجوز الخلط فيه. حين يقول هذا الكتاب إن "مبدأ الأمانة القرآني يُنتج نموذج حوكمة مختلفًا عن Stewardship Theory" — فهذا ادعاء في المستوى الثاني: اجتهاد بشري قابل للنقض. لكن حين يقول إن "القرآن الكريم يهدي للتي هي أقوم" — فهذه مسلَّمة في المستوى الأول: نقطة انطلاق لا محل اختبار.</w:t>
+        <w:t xml:space="preserve">وهذا تمييز لا يحتمل الخلط. حين أقول إن «مبدأ الأمانة القرآني يُنتج نموذج حوكمة مختلفًا عن Stewardship Theory» فهذا ادعاء من المستوى الثاني، أي اجتهاد بشري قد يثبت خطؤه. أما حين أقول إن «القرآن يهدي للتي هي أقوم» فهذه مسلّمة من المستوى الأول، أبدأ منها ولا أختبرها.</w:t>
       </w:r>
     </w:p>
     <w:p>
@@ -5153,7 +2869,7 @@
           <w:szCs w:val="28"/>
           <w:rtl/>
         </w:rPr>
-        <w:t xml:space="preserve">القاعدة: كل ادعاء في هذا الكتاب يُصنَّف صراحةً: هل هو نصٌّ قرآني يقيني (المستوى الأول)؟ أم اجتهاد اشتقاقي (المستوى الثاني)؟ أم نتيجة تجريبية تختبر ذلك الاجتهاد (المستوى الثالث)؟ والخلط بين المستويات من أخطر ما تقع فيه الكتابة الإسلامية المعاصرة. وينبغي ألا تُخلط هذه المستويات المعرفية الثلاثة بدرجات سلم الاشتقاق السباعي (م1–م7) التي يعرضها الفصل الخامس: الأولى تُصنِّف نوع المعرفة، والثانية تُحدِّد موضع الادعاء في مسار الانتقال من الآية إلى النموذج.</w:t>
+        <w:t xml:space="preserve">والقاعدة التي ألتزم بها في الكتاب كله أن يُصنَّف كل ادعاء صراحةً: أهو نص قرآني يقيني (المستوى الأول)، أم اجتهاد اشتقاقي (المستوى الثاني)، أم نتيجة تجريبية تختبر ذلك الاجتهاد (المستوى الثالث)؟ فالخلط بين هذه المستويات من أكثر ما يُضعف الكتابة الإسلامية المعاصرة. وينبغي ألا تُخلط هذه المستويات الثلاثة بدرجات سلم الاشتقاق السباعي (م1–م7) التي يعرضها الفصل الخامس؛ فالأولى تصنّف نوع المعرفة، والثانية تحدد موقع الادعاء في الطريق من الآية إلى النموذج.</w:t>
       </w:r>
     </w:p>
     <w:p>
@@ -5389,7 +3105,7 @@
                 <w:szCs w:val="28"/>
                 <w:rtl/>
               </w:rPr>
-              <w:t>المسلَّمة: السلطة والمصلحة تُشكِّلان المعرفة — لا معرفة محايدة</w:t>
+              <w:t xml:space="preserve">المسلَّمة: السلطة والمصلحة تشكّلان المعرفة، فلا معرفة محايدة</w:t>
             </w:r>
           </w:p>
         </w:tc>
@@ -5425,7 +3141,7 @@
                 <w:szCs w:val="28"/>
                 <w:rtl/>
               </w:rPr>
-              <w:t>المسلَّمة: الوحي الإلهي مصدر يقيني يُكمِّله العقل والتجربة — لا يُلغيهما</w:t>
+              <w:t xml:space="preserve">المسلَّمة: الوحي الإلهي مصدر يقيني، يكمّله العقل والتجربة ولا يلغيهما</w:t>
             </w:r>
           </w:p>
         </w:tc>
@@ -5495,7 +3211,7 @@
                 <w:szCs w:val="28"/>
                 <w:rtl/>
               </w:rPr>
-              <w:t>القيم: جزء من السياق — لا انفصال ممكن</w:t>
+              <w:t xml:space="preserve">القيم: جزء من السياق لا ينفصل عنه</w:t>
             </w:r>
           </w:p>
         </w:tc>
@@ -5529,7 +3245,7 @@
                 <w:szCs w:val="28"/>
                 <w:rtl/>
               </w:rPr>
-              <w:t>القيم: جزء عضوي من المنهجية — مصدرها الوحي</w:t>
+              <w:t xml:space="preserve">القيم: جزء أصيل من المنهج، ومصدرها الوحي</w:t>
             </w:r>
           </w:p>
         </w:tc>
@@ -5841,7 +3557,7 @@
                 <w:szCs w:val="28"/>
                 <w:rtl/>
               </w:rPr>
-              <w:t>نقطة الضعف: خطر خلط المسلَّمة بالادعاء — يُعالَج بسلم الاشتقاق</w:t>
+              <w:t xml:space="preserve">نقطة الضعف: خطر الخلط بين المسلَّمة والادعاء، ويعالجه سلم الاشتقاق</w:t>
             </w:r>
           </w:p>
         </w:tc>
@@ -5916,7 +3632,7 @@
           <w:szCs w:val="28"/>
           <w:rtl/>
         </w:rPr>
-        <w:t>1.3  أقومية القرآن — المبدأ الجوهري بمعنييه</w:t>
+        <w:t xml:space="preserve">1.3  أقومية القرآن: المبدأ الذي يحكم الكتاب</w:t>
       </w:r>
     </w:p>
     <w:p>
@@ -5973,7 +3689,7 @@
           <w:szCs w:val="28"/>
           <w:rtl/>
         </w:rPr>
-        <w:t>يقوم هذا المشروع على مبدأ يحكم كل ادعاء فيه ويُحدد العلاقة بين مصادر الاستدلال. اسم هذا المبدأ: أقومية القرآن. وهو مصدر صناعي مشتق من "أَقوم" — أفعل التفضيل من "قام" — مع ياء النسب وتاء التأنيث. بناءٌ لغوي مشروع في العربية المعاصرة يمنح المشروع مصطلحًا خاصًا يُعرِّف ذاته.</w:t>
+        <w:t xml:space="preserve">يقوم الكتاب كله على مبدأ واحد يحكم ادعاءاته ويحدد العلاقة بين مصادره، أسمّيه «أقومية القرآن». والكلمة مصدر صناعي من «أقوم»، أفعل التفضيل من «قام»، وهو بناء مشروع في العربية المعاصرة، اخترته ليكون للمشروع مصطلحه الخاص.</w:t>
       </w:r>
     </w:p>
     <w:p>
@@ -5997,7 +3713,7 @@
           <w:szCs w:val="28"/>
           <w:rtl/>
         </w:rPr>
-        <w:t xml:space="preserve">تحليل لغوي: الجذر ق-و-م يدل على الانتصاب والاستقامة والعدل، و«أَقوم» أفعل تفضيل: الأشد استقامةً والأعدل. قال ابن فارس في مقاييس اللغة (مادة قوم): «القاف والواو والميم أصلان صحيحان، يدل أحدهما على جماعة ناس، وربما استُعير في غيرهم، والآخر على انتصابٍ أو عَزْم». ومن الأصل الثاني جاءت الاستقامة، وهي المعنى المقصود في «أقوم».</w:t>
+        <w:t xml:space="preserve">تحليل لغوي: يدل الجذر ق-و-م على الانتصاب والاستقامة والعدل، و«أَقوم» أفعل تفضيل بمعنى الأشد استقامةً والأعدل. قال ابن فارس في مقاييس اللغة (مادة قوم): «القاف والواو والميم أصلان صحيحان، يدل أحدهما على جماعة ناس، وربما استُعير في غيرهم، والآخر على انتصابٍ أو عَزْم». ومن الأصل الثاني جاءت الاستقامة، وهي المعنى المقصود في «أقوم».</w:t>
       </w:r>
     </w:p>
     <w:p>
@@ -6032,7 +3748,7 @@
           <w:szCs w:val="28"/>
           <w:rtl/>
         </w:rPr>
-        <w:t>المعنى الأول — المحتوى: كل ما في القرآن هو الأقوم في ذاته</w:t>
+        <w:t xml:space="preserve">المعنى الأول، المحتوى: كل ما في القرآن هو الأقوم في ذاته</w:t>
       </w:r>
     </w:p>
     <w:p>
@@ -6053,7 +3769,7 @@
           <w:szCs w:val="28"/>
           <w:rtl/>
         </w:rPr>
-        <w:t>أحكامه وقيمه وتصوراته ومبادئه هي بطبيعتها أقوم مما سواها. ليس هذا حكم تفضيل نسبي — بل هو إعلان إلهي مطلق. هذا المعنى يُرسِّخ الثقة المطلقة بالمصدر: حين ننطلق من القرآن لبناء نظرية إدارية — ننطلق من قاعدة يقينية لا من فرضية بحاجة إلى إثبات.</w:t>
+        <w:t xml:space="preserve">فأحكامه وقيمه وتصوراته أقوم في ذاتها مما سواها، وهذا عندنا إعلان إلهي لا مفاضلة بشرية نسبية. ومعنى ذلك عمليًا أننا حين نبني من القرآن نظرية إدارية نبدأ من أرض صلبة، لا من فرضية تنتظر من يثبتها.</w:t>
       </w:r>
     </w:p>
     <w:p>
@@ -6077,7 +3793,7 @@
           <w:szCs w:val="28"/>
           <w:rtl/>
         </w:rPr>
-        <w:t>ابن عاشور، التحرير والتنوير (تفسير الإسراء:9): "التي هي أقوم: أي أعدل وأصوب وأنفع." فالقرآن لا يُقدِّم بديلًا من بين بدائل — بل يُقدِّم الأقوم من حيث الصواب والعدل والنفع.</w:t>
+        <w:t xml:space="preserve">ابن عاشور، التحرير والتنوير (تفسير الإسراء:9): "التي هي أقوم: أي أعدل وأصوب وأنفع." فالقرآن لا يقدّم خيارًا بين خيارات متكافئة، وإنما يقدّم الأقوم صوابًا وعدلًا ونفعًا.</w:t>
       </w:r>
     </w:p>
     <w:p>
@@ -6112,7 +3828,7 @@
           <w:szCs w:val="28"/>
           <w:rtl/>
         </w:rPr>
-        <w:t>المعنى الثاني — المنهج: القرآن يهدي إلى الطريق الأقوم في كل مجال</w:t>
+        <w:t xml:space="preserve">المعنى الثاني، المنهج: القرآن يهدي إلى الطريق الأقوم في كل مجال</w:t>
       </w:r>
     </w:p>
     <w:p>
@@ -6133,7 +3849,7 @@
           <w:szCs w:val="28"/>
           <w:rtl/>
         </w:rPr>
-        <w:t>لا يُعطي القرآن نتائج جاهزة في كل مجال من مجالات الحياة — بل يمنح منهجًا يُبصِّر صاحبه بالأقوم في السياسة والاقتصاد والإدارة والتربية وسائر الشأن الإنساني. من يتدبر القرآن بصدق وعلم لا يحصل فقط على إجابات — بل يحصل على طريقة تفكير تُعينه على الوصول إلى الإجابات حتى في مسائل لم يُنزَل فيها نص مباشر.</w:t>
+        <w:t xml:space="preserve">والقرآن لا يقدّم نتائج جاهزة لكل مسألة في الحياة، لكنه يمنح منهجًا يبصّر صاحبه بالأقوم في السياسة والاقتصاد والإدارة والتربية وغيرها. ومن يتدبّره بعلم وصدق لا يخرج بأجوبة فقط، بل بطريقة في التفكير تعينه على الوصول إلى الجواب حتى فيما لم يرد فيه نص مباشر.</w:t>
       </w:r>
     </w:p>
     <w:p>
@@ -6226,7 +3942,7 @@
                 <w:szCs w:val="28"/>
                 <w:rtl/>
               </w:rPr>
-              <w:t>المعنى الأول — المحتوى</w:t>
+              <w:t xml:space="preserve">المعنى الأول: المحتوى</w:t>
             </w:r>
           </w:p>
         </w:tc>
@@ -6262,7 +3978,7 @@
                 <w:szCs w:val="28"/>
                 <w:rtl/>
               </w:rPr>
-              <w:t>المعنى الثاني — المنهج</w:t>
+              <w:t xml:space="preserve">المعنى الثاني: المنهج</w:t>
             </w:r>
           </w:p>
         </w:tc>
@@ -6523,8 +4239,7 @@
           <w:szCs w:val="28"/>
           <w:rtl/>
         </w:rPr>
-        <w:lastRenderedPageBreak/>
-        <w:t>التطبيق على هذا الكتاب: لا نبحث فقط عن "ما يقوله القرآن عن الإدارة" (المعنى الأول) — بل نبني عقلًا إداريًا يفكر من القرآن ويتحرك بمنهجه (المعنى الثاني). الفارق جوهري: الأول يُضيف كتابًا إلى الرف، والثاني يُؤسِّس علمًا.</w:t>
+        <w:t xml:space="preserve">وعلى هذا الكتاب أن يجمع المعنيين: ألّا يكتفي بجمع ما يقوله القرآن عن الإدارة، وأن يحاول بناء عقل إداري يفكر من القرآن ويتحرك بمنهجه. الأول يضيف كتابًا إلى الرف، والثاني قد يؤسس علمًا.</w:t>
       </w:r>
     </w:p>
     <w:p>
@@ -6573,7 +4288,7 @@
           <w:szCs w:val="28"/>
           <w:rtl/>
         </w:rPr>
-        <w:t>1.4  القرآن دستورًا — وهرم المصادر</w:t>
+        <w:t xml:space="preserve">1.4  القرآن دستورًا، وهرم المصادر</w:t>
       </w:r>
     </w:p>
     <w:tbl>
@@ -6630,223 +4345,7 @@
                 <w:szCs w:val="28"/>
                 <w:rtl/>
               </w:rPr>
-              <w:t>📌</w:t>
-            </w:r>
-            <w:r>
-              <w:rPr>
-                <w:rFonts w:ascii="Sakkal Majalla" w:hAnsi="Sakkal Majalla" w:cs="Sakkal Majalla"/>
-                <w:b/>
-                <w:bCs/>
-                <w:color w:val="FFFFFF"/>
-                <w:sz w:val="28"/>
-                <w:szCs w:val="28"/>
-                <w:rtl/>
-              </w:rPr>
-              <w:t xml:space="preserve">  </w:t>
-            </w:r>
-            <w:r>
-              <w:rPr>
-                <w:rFonts w:ascii="Sakkal Majalla" w:hAnsi="Sakkal Majalla" w:cs="Sakkal Majalla" w:hint="cs"/>
-                <w:b/>
-                <w:bCs/>
-                <w:color w:val="FFFFFF"/>
-                <w:sz w:val="28"/>
-                <w:szCs w:val="28"/>
-                <w:rtl/>
-              </w:rPr>
-              <w:t>ملاحظة</w:t>
-            </w:r>
-            <w:r>
-              <w:rPr>
-                <w:rFonts w:ascii="Sakkal Majalla" w:hAnsi="Sakkal Majalla" w:cs="Sakkal Majalla"/>
-                <w:b/>
-                <w:bCs/>
-                <w:color w:val="FFFFFF"/>
-                <w:sz w:val="28"/>
-                <w:szCs w:val="28"/>
-                <w:rtl/>
-              </w:rPr>
-              <w:t xml:space="preserve"> </w:t>
-            </w:r>
-            <w:r>
-              <w:rPr>
-                <w:rFonts w:ascii="Sakkal Majalla" w:hAnsi="Sakkal Majalla" w:cs="Sakkal Majalla" w:hint="cs"/>
-                <w:b/>
-                <w:bCs/>
-                <w:color w:val="FFFFFF"/>
-                <w:sz w:val="28"/>
-                <w:szCs w:val="28"/>
-                <w:rtl/>
-              </w:rPr>
-              <w:t>منهجية</w:t>
-            </w:r>
-            <w:r>
-              <w:rPr>
-                <w:rFonts w:ascii="Sakkal Majalla" w:hAnsi="Sakkal Majalla" w:cs="Sakkal Majalla"/>
-                <w:b/>
-                <w:bCs/>
-                <w:color w:val="FFFFFF"/>
-                <w:sz w:val="28"/>
-                <w:szCs w:val="28"/>
-                <w:rtl/>
-              </w:rPr>
-              <w:t xml:space="preserve"> </w:t>
-            </w:r>
-            <w:r>
-              <w:rPr>
-                <w:rFonts w:ascii="Sakkal Majalla" w:hAnsi="Sakkal Majalla" w:cs="Sakkal Majalla" w:hint="cs"/>
-                <w:b/>
-                <w:bCs/>
-                <w:color w:val="FFFFFF"/>
-                <w:sz w:val="28"/>
-                <w:szCs w:val="28"/>
-                <w:rtl/>
-              </w:rPr>
-              <w:t>إلزامية</w:t>
-            </w:r>
-            <w:r>
-              <w:rPr>
-                <w:rFonts w:ascii="Sakkal Majalla" w:hAnsi="Sakkal Majalla" w:cs="Sakkal Majalla"/>
-                <w:b/>
-                <w:bCs/>
-                <w:color w:val="FFFFFF"/>
-                <w:sz w:val="28"/>
-                <w:szCs w:val="28"/>
-                <w:rtl/>
-              </w:rPr>
-              <w:t xml:space="preserve"> </w:t>
-            </w:r>
-            <w:r>
-              <w:rPr>
-                <w:rFonts w:ascii="Sakkal Majalla" w:hAnsi="Sakkal Majalla" w:cs="Sakkal Majalla" w:hint="cs"/>
-                <w:b/>
-                <w:bCs/>
-                <w:color w:val="FFFFFF"/>
-                <w:sz w:val="28"/>
-                <w:szCs w:val="28"/>
-                <w:rtl/>
-              </w:rPr>
-              <w:t>—</w:t>
-            </w:r>
-            <w:r>
-              <w:rPr>
-                <w:rFonts w:ascii="Sakkal Majalla" w:hAnsi="Sakkal Majalla" w:cs="Sakkal Majalla"/>
-                <w:b/>
-                <w:bCs/>
-                <w:color w:val="FFFFFF"/>
-                <w:sz w:val="28"/>
-                <w:szCs w:val="28"/>
-                <w:rtl/>
-              </w:rPr>
-              <w:t xml:space="preserve"> </w:t>
-            </w:r>
-            <w:r>
-              <w:rPr>
-                <w:rFonts w:ascii="Sakkal Majalla" w:hAnsi="Sakkal Majalla" w:cs="Sakkal Majalla" w:hint="cs"/>
-                <w:b/>
-                <w:bCs/>
-                <w:color w:val="FFFFFF"/>
-                <w:sz w:val="28"/>
-                <w:szCs w:val="28"/>
-                <w:rtl/>
-              </w:rPr>
-              <w:t>موقف</w:t>
-            </w:r>
-            <w:r>
-              <w:rPr>
-                <w:rFonts w:ascii="Sakkal Majalla" w:hAnsi="Sakkal Majalla" w:cs="Sakkal Majalla"/>
-                <w:b/>
-                <w:bCs/>
-                <w:color w:val="FFFFFF"/>
-                <w:sz w:val="28"/>
-                <w:szCs w:val="28"/>
-                <w:rtl/>
-              </w:rPr>
-              <w:t xml:space="preserve"> </w:t>
-            </w:r>
-            <w:r>
-              <w:rPr>
-                <w:rFonts w:ascii="Sakkal Majalla" w:hAnsi="Sakkal Majalla" w:cs="Sakkal Majalla" w:hint="cs"/>
-                <w:b/>
-                <w:bCs/>
-                <w:color w:val="FFFFFF"/>
-                <w:sz w:val="28"/>
-                <w:szCs w:val="28"/>
-                <w:rtl/>
-              </w:rPr>
-              <w:t>الكتاب</w:t>
-            </w:r>
-            <w:r>
-              <w:rPr>
-                <w:rFonts w:ascii="Sakkal Majalla" w:hAnsi="Sakkal Majalla" w:cs="Sakkal Majalla"/>
-                <w:b/>
-                <w:bCs/>
-                <w:color w:val="FFFFFF"/>
-                <w:sz w:val="28"/>
-                <w:szCs w:val="28"/>
-                <w:rtl/>
-              </w:rPr>
-              <w:t xml:space="preserve"> </w:t>
-            </w:r>
-            <w:r>
-              <w:rPr>
-                <w:rFonts w:ascii="Sakkal Majalla" w:hAnsi="Sakkal Majalla" w:cs="Sakkal Majalla" w:hint="cs"/>
-                <w:b/>
-                <w:bCs/>
-                <w:color w:val="FFFFFF"/>
-                <w:sz w:val="28"/>
-                <w:szCs w:val="28"/>
-                <w:rtl/>
-              </w:rPr>
-              <w:t>من</w:t>
-            </w:r>
-            <w:r>
-              <w:rPr>
-                <w:rFonts w:ascii="Sakkal Majalla" w:hAnsi="Sakkal Majalla" w:cs="Sakkal Majalla"/>
-                <w:b/>
-                <w:bCs/>
-                <w:color w:val="FFFFFF"/>
-                <w:sz w:val="28"/>
-                <w:szCs w:val="28"/>
-                <w:rtl/>
-              </w:rPr>
-              <w:t xml:space="preserve"> </w:t>
-            </w:r>
-            <w:r>
-              <w:rPr>
-                <w:rFonts w:ascii="Sakkal Majalla" w:hAnsi="Sakkal Majalla" w:cs="Sakkal Majalla" w:hint="cs"/>
-                <w:b/>
-                <w:bCs/>
-                <w:color w:val="FFFFFF"/>
-                <w:sz w:val="28"/>
-                <w:szCs w:val="28"/>
-                <w:rtl/>
-              </w:rPr>
-              <w:t>السنة</w:t>
-            </w:r>
-            <w:r>
-              <w:rPr>
-                <w:rFonts w:ascii="Sakkal Majalla" w:hAnsi="Sakkal Majalla" w:cs="Sakkal Majalla"/>
-                <w:b/>
-                <w:bCs/>
-                <w:color w:val="FFFFFF"/>
-                <w:sz w:val="28"/>
-                <w:szCs w:val="28"/>
-                <w:rtl/>
-              </w:rPr>
-              <w:t xml:space="preserve"> </w:t>
-            </w:r>
-            <w:r>
-              <w:rPr>
-                <w:rFonts w:ascii="Sakkal Majalla" w:hAnsi="Sakkal Majalla" w:cs="Sakkal Majalla" w:hint="cs"/>
-                <w:b/>
-                <w:bCs/>
-                <w:color w:val="FFFFFF"/>
-                <w:sz w:val="28"/>
-                <w:szCs w:val="28"/>
-                <w:rtl/>
-              </w:rPr>
-              <w:t>النبوية</w:t>
+              <w:t xml:space="preserve">ملاحظة منهجية: موقف الكتاب من السنة النبوية</w:t>
             </w:r>
           </w:p>
         </w:tc>
@@ -6882,7 +4381,7 @@
                 <w:szCs w:val="28"/>
                 <w:rtl/>
               </w:rPr>
-              <w:t>في منهج هذا الكتاب تُعامَل السنة النبوية الصحيحة بوصفها مصدرًا بيانيًا وتطبيقيًا للمفهوم القرآني، لا بوصفها منشأً مستقلًا للمفاهيم التي يدَّعي الكتاب قرآنيَّتها. هذا موقف إجرائي داخل هذا المشروع — يُحدِّد طريقة عمله ومجال ادعائه — لا حكماً في المسألة الأصولية الواسعة المتعلقة بحجة السنة ومكانتها التشريعية، التي تظل مجالًا للاجتهاد العلمي المتخصص.</w:t>
+              <w:t xml:space="preserve">يتعامل هذا الكتاب مع السنة النبوية الثابتة بوصفها بيانًا للمفهوم القرآني وتطبيقًا له، لا منشأً مستقلًا للمفاهيم التي يدّعي أنها قرآنية. وهذا اختيار إجرائي يحدد طريقة عمل المشروع وحدود ادعائه، وليس حكمًا في المسألة الأصولية الواسعة المتعلقة بحجية السنة ومكانتها التشريعية؛ فتلك مسألة لها أهلها من المتخصصين.</w:t>
             </w:r>
           </w:p>
         </w:tc>
@@ -6917,7 +4416,7 @@
           <w:szCs w:val="28"/>
           <w:rtl/>
         </w:rPr>
-        <w:t xml:space="preserve">يُترجَم مبدأ أقومية القرآن إلى هرم للمصادر يُحدِّد العلاقة بين القرآن وما سواه من مصادر الاستدلال في هذا الكتاب. نعرض هنا صورته الكلية في ثلاث طبقات، ويُفصِّله الفصل الرابع بمستوياته ومعايير القبول في كل مستوى:</w:t>
+        <w:t xml:space="preserve">ومن مبدأ الأقومية يتفرّع هرم للمصادر يحدد مكان القرآن من سائر ما يُستدل به في الكتاب. أعرض هنا صورته الكلية في ثلاث طبقات، ويفصّله الفصل الرابع بمستوياته ومعايير القبول في كل منها:</w:t>
       </w:r>
     </w:p>
     <w:tbl>
@@ -6974,127 +4473,7 @@
                 <w:szCs w:val="28"/>
                 <w:rtl/>
               </w:rPr>
-              <w:t>①</w:t>
-            </w:r>
-            <w:r>
-              <w:rPr>
-                <w:rFonts w:ascii="Sakkal Majalla" w:hAnsi="Sakkal Majalla" w:cs="Sakkal Majalla"/>
-                <w:b/>
-                <w:bCs/>
-                <w:color w:val="FFFFFF"/>
-                <w:sz w:val="28"/>
-                <w:szCs w:val="28"/>
-                <w:rtl/>
-              </w:rPr>
-              <w:t xml:space="preserve"> </w:t>
-            </w:r>
-            <w:r>
-              <w:rPr>
-                <w:rFonts w:ascii="Sakkal Majalla" w:hAnsi="Sakkal Majalla" w:cs="Sakkal Majalla" w:hint="cs"/>
-                <w:b/>
-                <w:bCs/>
-                <w:color w:val="FFFFFF"/>
-                <w:sz w:val="28"/>
-                <w:szCs w:val="28"/>
-                <w:rtl/>
-              </w:rPr>
-              <w:t>القرآن</w:t>
-            </w:r>
-            <w:r>
-              <w:rPr>
-                <w:rFonts w:ascii="Sakkal Majalla" w:hAnsi="Sakkal Majalla" w:cs="Sakkal Majalla"/>
-                <w:b/>
-                <w:bCs/>
-                <w:color w:val="FFFFFF"/>
-                <w:sz w:val="28"/>
-                <w:szCs w:val="28"/>
-                <w:rtl/>
-              </w:rPr>
-              <w:t xml:space="preserve"> </w:t>
-            </w:r>
-            <w:r>
-              <w:rPr>
-                <w:rFonts w:ascii="Sakkal Majalla" w:hAnsi="Sakkal Majalla" w:cs="Sakkal Majalla" w:hint="cs"/>
-                <w:b/>
-                <w:bCs/>
-                <w:color w:val="FFFFFF"/>
-                <w:sz w:val="28"/>
-                <w:szCs w:val="28"/>
-                <w:rtl/>
-              </w:rPr>
-              <w:t>الكريم</w:t>
-            </w:r>
-            <w:r>
-              <w:rPr>
-                <w:rFonts w:ascii="Sakkal Majalla" w:hAnsi="Sakkal Majalla" w:cs="Sakkal Majalla"/>
-                <w:b/>
-                <w:bCs/>
-                <w:color w:val="FFFFFF"/>
-                <w:sz w:val="28"/>
-                <w:szCs w:val="28"/>
-                <w:rtl/>
-              </w:rPr>
-              <w:t xml:space="preserve"> </w:t>
-            </w:r>
-            <w:r>
-              <w:rPr>
-                <w:rFonts w:ascii="Sakkal Majalla" w:hAnsi="Sakkal Majalla" w:cs="Sakkal Majalla" w:hint="cs"/>
-                <w:b/>
-                <w:bCs/>
-                <w:color w:val="FFFFFF"/>
-                <w:sz w:val="28"/>
-                <w:szCs w:val="28"/>
-                <w:rtl/>
-              </w:rPr>
-              <w:t>—</w:t>
-            </w:r>
-            <w:r>
-              <w:rPr>
-                <w:rFonts w:ascii="Sakkal Majalla" w:hAnsi="Sakkal Majalla" w:cs="Sakkal Majalla"/>
-                <w:b/>
-                <w:bCs/>
-                <w:color w:val="FFFFFF"/>
-                <w:sz w:val="28"/>
-                <w:szCs w:val="28"/>
-                <w:rtl/>
-              </w:rPr>
-              <w:t xml:space="preserve"> </w:t>
-            </w:r>
-            <w:r>
-              <w:rPr>
-                <w:rFonts w:ascii="Sakkal Majalla" w:hAnsi="Sakkal Majalla" w:cs="Sakkal Majalla" w:hint="cs"/>
-                <w:b/>
-                <w:bCs/>
-                <w:color w:val="FFFFFF"/>
-                <w:sz w:val="28"/>
-                <w:szCs w:val="28"/>
-                <w:rtl/>
-              </w:rPr>
-              <w:t>المنشأ</w:t>
-            </w:r>
-            <w:r>
-              <w:rPr>
-                <w:rFonts w:ascii="Sakkal Majalla" w:hAnsi="Sakkal Majalla" w:cs="Sakkal Majalla"/>
-                <w:b/>
-                <w:bCs/>
-                <w:color w:val="FFFFFF"/>
-                <w:sz w:val="28"/>
-                <w:szCs w:val="28"/>
-                <w:rtl/>
-              </w:rPr>
-              <w:t xml:space="preserve"> </w:t>
-            </w:r>
-            <w:r>
-              <w:rPr>
-                <w:rFonts w:ascii="Sakkal Majalla" w:hAnsi="Sakkal Majalla" w:cs="Sakkal Majalla" w:hint="cs"/>
-                <w:b/>
-                <w:bCs/>
-                <w:color w:val="FFFFFF"/>
-                <w:sz w:val="28"/>
-                <w:szCs w:val="28"/>
-                <w:rtl/>
-              </w:rPr>
-              <w:t>والدستور</w:t>
+              <w:t xml:space="preserve">① القرآن الكريم: المنشأ والدستور</w:t>
             </w:r>
           </w:p>
         </w:tc>
@@ -7130,7 +4509,7 @@
                 <w:szCs w:val="28"/>
                 <w:rtl/>
               </w:rPr>
-              <w:t>المنشأ الحصري لجميع أفكار الموسوعة ومفاهيمها. القرآن لا يُستشهد به مؤيِّدًا — بل يُنطلَق منه مؤسِّسًا. هو الدستور الذي تتفرع عنه كل التفاصيل، لا مجرد مرجع يُقتَبَس منه.</w:t>
+              <w:t xml:space="preserve">منه تنشأ أفكار الموسوعة ومفاهيمها جميعًا. لا نستشهد به لتأييد فكرة جاءت من غيره، بل نبدأ منه؛ فهو الدستور الذي تتفرّع عنه التفاصيل، لا مرجع يُقتبس منه عند الحاجة.</w:t>
             </w:r>
           </w:p>
         </w:tc>
@@ -7168,199 +4547,7 @@
                 <w:szCs w:val="28"/>
                 <w:rtl/>
               </w:rPr>
-              <w:t>②</w:t>
-            </w:r>
-            <w:r>
-              <w:rPr>
-                <w:rFonts w:ascii="Sakkal Majalla" w:hAnsi="Sakkal Majalla" w:cs="Sakkal Majalla"/>
-                <w:b/>
-                <w:bCs/>
-                <w:color w:val="FFFFFF"/>
-                <w:sz w:val="28"/>
-                <w:szCs w:val="28"/>
-                <w:rtl/>
-              </w:rPr>
-              <w:t xml:space="preserve"> </w:t>
-            </w:r>
-            <w:r>
-              <w:rPr>
-                <w:rFonts w:ascii="Sakkal Majalla" w:hAnsi="Sakkal Majalla" w:cs="Sakkal Majalla" w:hint="cs"/>
-                <w:b/>
-                <w:bCs/>
-                <w:color w:val="FFFFFF"/>
-                <w:sz w:val="28"/>
-                <w:szCs w:val="28"/>
-                <w:rtl/>
-              </w:rPr>
-              <w:t>السنة</w:t>
-            </w:r>
-            <w:r>
-              <w:rPr>
-                <w:rFonts w:ascii="Sakkal Majalla" w:hAnsi="Sakkal Majalla" w:cs="Sakkal Majalla"/>
-                <w:b/>
-                <w:bCs/>
-                <w:color w:val="FFFFFF"/>
-                <w:sz w:val="28"/>
-                <w:szCs w:val="28"/>
-                <w:rtl/>
-              </w:rPr>
-              <w:t xml:space="preserve"> </w:t>
-            </w:r>
-            <w:r>
-              <w:rPr>
-                <w:rFonts w:ascii="Sakkal Majalla" w:hAnsi="Sakkal Majalla" w:cs="Sakkal Majalla" w:hint="cs"/>
-                <w:b/>
-                <w:bCs/>
-                <w:color w:val="FFFFFF"/>
-                <w:sz w:val="28"/>
-                <w:szCs w:val="28"/>
-                <w:rtl/>
-              </w:rPr>
-              <w:t>النبوية</w:t>
-            </w:r>
-            <w:r>
-              <w:rPr>
-                <w:rFonts w:ascii="Sakkal Majalla" w:hAnsi="Sakkal Majalla" w:cs="Sakkal Majalla"/>
-                <w:b/>
-                <w:bCs/>
-                <w:color w:val="FFFFFF"/>
-                <w:sz w:val="28"/>
-                <w:szCs w:val="28"/>
-                <w:rtl/>
-              </w:rPr>
-              <w:t xml:space="preserve"> </w:t>
-            </w:r>
-            <w:r>
-              <w:rPr>
-                <w:rFonts w:ascii="Sakkal Majalla" w:hAnsi="Sakkal Majalla" w:cs="Sakkal Majalla" w:hint="cs"/>
-                <w:b/>
-                <w:bCs/>
-                <w:color w:val="FFFFFF"/>
-                <w:sz w:val="28"/>
-                <w:szCs w:val="28"/>
-                <w:rtl/>
-              </w:rPr>
-              <w:t>—</w:t>
-            </w:r>
-            <w:r>
-              <w:rPr>
-                <w:rFonts w:ascii="Sakkal Majalla" w:hAnsi="Sakkal Majalla" w:cs="Sakkal Majalla"/>
-                <w:b/>
-                <w:bCs/>
-                <w:color w:val="FFFFFF"/>
-                <w:sz w:val="28"/>
-                <w:szCs w:val="28"/>
-                <w:rtl/>
-              </w:rPr>
-              <w:t xml:space="preserve"> </w:t>
-            </w:r>
-            <w:r>
-              <w:rPr>
-                <w:rFonts w:ascii="Sakkal Majalla" w:hAnsi="Sakkal Majalla" w:cs="Sakkal Majalla" w:hint="cs"/>
-                <w:b/>
-                <w:bCs/>
-                <w:color w:val="FFFFFF"/>
-                <w:sz w:val="28"/>
-                <w:szCs w:val="28"/>
-                <w:rtl/>
-              </w:rPr>
-              <w:t>بيان</w:t>
-            </w:r>
-            <w:r>
-              <w:rPr>
-                <w:rFonts w:ascii="Sakkal Majalla" w:hAnsi="Sakkal Majalla" w:cs="Sakkal Majalla"/>
-                <w:b/>
-                <w:bCs/>
-                <w:color w:val="FFFFFF"/>
-                <w:sz w:val="28"/>
-                <w:szCs w:val="28"/>
-                <w:rtl/>
-              </w:rPr>
-              <w:t xml:space="preserve"> </w:t>
-            </w:r>
-            <w:r>
-              <w:rPr>
-                <w:rFonts w:ascii="Sakkal Majalla" w:hAnsi="Sakkal Majalla" w:cs="Sakkal Majalla" w:hint="cs"/>
-                <w:b/>
-                <w:bCs/>
-                <w:color w:val="FFFFFF"/>
-                <w:sz w:val="28"/>
-                <w:szCs w:val="28"/>
-                <w:rtl/>
-              </w:rPr>
-              <w:t>تطبيقي</w:t>
-            </w:r>
-            <w:r>
-              <w:rPr>
-                <w:rFonts w:ascii="Sakkal Majalla" w:hAnsi="Sakkal Majalla" w:cs="Sakkal Majalla"/>
-                <w:b/>
-                <w:bCs/>
-                <w:color w:val="FFFFFF"/>
-                <w:sz w:val="28"/>
-                <w:szCs w:val="28"/>
-                <w:rtl/>
-              </w:rPr>
-              <w:t xml:space="preserve"> </w:t>
-            </w:r>
-            <w:r>
-              <w:rPr>
-                <w:rFonts w:ascii="Sakkal Majalla" w:hAnsi="Sakkal Majalla" w:cs="Sakkal Majalla" w:hint="cs"/>
-                <w:b/>
-                <w:bCs/>
-                <w:color w:val="FFFFFF"/>
-                <w:sz w:val="28"/>
-                <w:szCs w:val="28"/>
-                <w:rtl/>
-              </w:rPr>
-              <w:t>لا</w:t>
-            </w:r>
-            <w:r>
-              <w:rPr>
-                <w:rFonts w:ascii="Sakkal Majalla" w:hAnsi="Sakkal Majalla" w:cs="Sakkal Majalla"/>
-                <w:b/>
-                <w:bCs/>
-                <w:color w:val="FFFFFF"/>
-                <w:sz w:val="28"/>
-                <w:szCs w:val="28"/>
-                <w:rtl/>
-              </w:rPr>
-              <w:t xml:space="preserve"> </w:t>
-            </w:r>
-            <w:r>
-              <w:rPr>
-                <w:rFonts w:ascii="Sakkal Majalla" w:hAnsi="Sakkal Majalla" w:cs="Sakkal Majalla" w:hint="cs"/>
-                <w:b/>
-                <w:bCs/>
-                <w:color w:val="FFFFFF"/>
-                <w:sz w:val="28"/>
-                <w:szCs w:val="28"/>
-                <w:rtl/>
-              </w:rPr>
-              <w:t>منشأ</w:t>
-            </w:r>
-            <w:r>
-              <w:rPr>
-                <w:rFonts w:ascii="Sakkal Majalla" w:hAnsi="Sakkal Majalla" w:cs="Sakkal Majalla"/>
-                <w:b/>
-                <w:bCs/>
-                <w:color w:val="FFFFFF"/>
-                <w:sz w:val="28"/>
-                <w:szCs w:val="28"/>
-                <w:rtl/>
-              </w:rPr>
-              <w:t xml:space="preserve"> </w:t>
-            </w:r>
-            <w:r>
-              <w:rPr>
-                <w:rFonts w:ascii="Sakkal Majalla" w:hAnsi="Sakkal Majalla" w:cs="Sakkal Majalla" w:hint="cs"/>
-                <w:b/>
-                <w:bCs/>
-                <w:color w:val="FFFFFF"/>
-                <w:sz w:val="28"/>
-                <w:szCs w:val="28"/>
-                <w:rtl/>
-              </w:rPr>
-              <w:t>مستقل</w:t>
+              <w:t xml:space="preserve">② السنة النبوية: بيان وتطبيق، لا منشأ مستقل</w:t>
             </w:r>
           </w:p>
         </w:tc>
@@ -7396,7 +4583,7 @@
                 <w:szCs w:val="28"/>
                 <w:rtl/>
               </w:rPr>
-              <w:t xml:space="preserve">السنة الثابتة تُبيِّن المفاهيم القرآنية وتُفصِّلها وتُجسِّدها — بيان تفسيري (حديث جبريل في الإحسان)  │  بيان تطبيقي (مشاورات السيرة في الشورى)  │  بيان نطاقي ("كلكم راعٍ" في الأمانة). وقد نُقل عن الإمام الشافعي قوله: "جميع ما تقوله الأمة شرحٌ للسنة، وجميع السنة شرحٌ للقرآن" (السيوطي، الإتقان في علوم القرآن). ومعايير قبول الحديث مفصَّلة في الفصل الرابع.</w:t>
+              <w:t xml:space="preserve">السنة الثابتة تبيّن المفاهيم القرآنية وتفصّلها وتجسّدها، ولهذا البيان ثلاث صور: بيان تفسيري (حديث جبريل في الإحسان)، وبيان تطبيقي (مشاورات السيرة في الشورى)، وبيان نطاقي ("كلكم راعٍ" في الأمانة). وقد نُقل عن الإمام الشافعي قوله: "جميع ما تقوله الأمة شرحٌ للسنة، وجميع السنة شرحٌ للقرآن" (السيوطي، الإتقان في علوم القرآن). ومعايير قبول الحديث مفصّلة في الفصل الرابع.</w:t>
             </w:r>
           </w:p>
         </w:tc>
@@ -7434,151 +4621,7 @@
                 <w:szCs w:val="28"/>
                 <w:rtl/>
               </w:rPr>
-              <w:t>③</w:t>
-            </w:r>
-            <w:r>
-              <w:rPr>
-                <w:rFonts w:ascii="Sakkal Majalla" w:hAnsi="Sakkal Majalla" w:cs="Sakkal Majalla"/>
-                <w:b/>
-                <w:bCs/>
-                <w:color w:val="FFFFFF"/>
-                <w:sz w:val="28"/>
-                <w:szCs w:val="28"/>
-                <w:rtl/>
-              </w:rPr>
-              <w:t xml:space="preserve"> </w:t>
-            </w:r>
-            <w:r>
-              <w:rPr>
-                <w:rFonts w:ascii="Sakkal Majalla" w:hAnsi="Sakkal Majalla" w:cs="Sakkal Majalla" w:hint="cs"/>
-                <w:b/>
-                <w:bCs/>
-                <w:color w:val="FFFFFF"/>
-                <w:sz w:val="28"/>
-                <w:szCs w:val="28"/>
-                <w:rtl/>
-              </w:rPr>
-              <w:t>التفسير</w:t>
-            </w:r>
-            <w:r>
-              <w:rPr>
-                <w:rFonts w:ascii="Sakkal Majalla" w:hAnsi="Sakkal Majalla" w:cs="Sakkal Majalla"/>
-                <w:b/>
-                <w:bCs/>
-                <w:color w:val="FFFFFF"/>
-                <w:sz w:val="28"/>
-                <w:szCs w:val="28"/>
-                <w:rtl/>
-              </w:rPr>
-              <w:t xml:space="preserve"> </w:t>
-            </w:r>
-            <w:r>
-              <w:rPr>
-                <w:rFonts w:ascii="Sakkal Majalla" w:hAnsi="Sakkal Majalla" w:cs="Sakkal Majalla" w:hint="cs"/>
-                <w:b/>
-                <w:bCs/>
-                <w:color w:val="FFFFFF"/>
-                <w:sz w:val="28"/>
-                <w:szCs w:val="28"/>
-                <w:rtl/>
-              </w:rPr>
-              <w:t>والسيرة</w:t>
-            </w:r>
-            <w:r>
-              <w:rPr>
-                <w:rFonts w:ascii="Sakkal Majalla" w:hAnsi="Sakkal Majalla" w:cs="Sakkal Majalla"/>
-                <w:b/>
-                <w:bCs/>
-                <w:color w:val="FFFFFF"/>
-                <w:sz w:val="28"/>
-                <w:szCs w:val="28"/>
-                <w:rtl/>
-              </w:rPr>
-              <w:t xml:space="preserve"> </w:t>
-            </w:r>
-            <w:r>
-              <w:rPr>
-                <w:rFonts w:ascii="Sakkal Majalla" w:hAnsi="Sakkal Majalla" w:cs="Sakkal Majalla" w:hint="cs"/>
-                <w:b/>
-                <w:bCs/>
-                <w:color w:val="FFFFFF"/>
-                <w:sz w:val="28"/>
-                <w:szCs w:val="28"/>
-                <w:rtl/>
-              </w:rPr>
-              <w:t>والكتب</w:t>
-            </w:r>
-            <w:r>
-              <w:rPr>
-                <w:rFonts w:ascii="Sakkal Majalla" w:hAnsi="Sakkal Majalla" w:cs="Sakkal Majalla"/>
-                <w:b/>
-                <w:bCs/>
-                <w:color w:val="FFFFFF"/>
-                <w:sz w:val="28"/>
-                <w:szCs w:val="28"/>
-                <w:rtl/>
-              </w:rPr>
-              <w:t xml:space="preserve"> </w:t>
-            </w:r>
-            <w:r>
-              <w:rPr>
-                <w:rFonts w:ascii="Sakkal Majalla" w:hAnsi="Sakkal Majalla" w:cs="Sakkal Majalla" w:hint="cs"/>
-                <w:b/>
-                <w:bCs/>
-                <w:color w:val="FFFFFF"/>
-                <w:sz w:val="28"/>
-                <w:szCs w:val="28"/>
-                <w:rtl/>
-              </w:rPr>
-              <w:t>—</w:t>
-            </w:r>
-            <w:r>
-              <w:rPr>
-                <w:rFonts w:ascii="Sakkal Majalla" w:hAnsi="Sakkal Majalla" w:cs="Sakkal Majalla"/>
-                <w:b/>
-                <w:bCs/>
-                <w:color w:val="FFFFFF"/>
-                <w:sz w:val="28"/>
-                <w:szCs w:val="28"/>
-                <w:rtl/>
-              </w:rPr>
-              <w:t xml:space="preserve"> </w:t>
-            </w:r>
-            <w:r>
-              <w:rPr>
-                <w:rFonts w:ascii="Sakkal Majalla" w:hAnsi="Sakkal Majalla" w:cs="Sakkal Majalla" w:hint="cs"/>
-                <w:b/>
-                <w:bCs/>
-                <w:color w:val="FFFFFF"/>
-                <w:sz w:val="28"/>
-                <w:szCs w:val="28"/>
-                <w:rtl/>
-              </w:rPr>
-              <w:t>مفاتيح</w:t>
-            </w:r>
-            <w:r>
-              <w:rPr>
-                <w:rFonts w:ascii="Sakkal Majalla" w:hAnsi="Sakkal Majalla" w:cs="Sakkal Majalla"/>
-                <w:b/>
-                <w:bCs/>
-                <w:color w:val="FFFFFF"/>
-                <w:sz w:val="28"/>
-                <w:szCs w:val="28"/>
-                <w:rtl/>
-              </w:rPr>
-              <w:t xml:space="preserve"> </w:t>
-            </w:r>
-            <w:r>
-              <w:rPr>
-                <w:rFonts w:ascii="Sakkal Majalla" w:hAnsi="Sakkal Majalla" w:cs="Sakkal Majalla" w:hint="cs"/>
-                <w:b/>
-                <w:bCs/>
-                <w:color w:val="FFFFFF"/>
-                <w:sz w:val="28"/>
-                <w:szCs w:val="28"/>
-                <w:rtl/>
-              </w:rPr>
-              <w:t>شرحية</w:t>
+              <w:t xml:space="preserve">③ التفسير والسيرة وكتب اللغة: مفاتيح للفهم</w:t>
             </w:r>
           </w:p>
         </w:tc>
@@ -7614,7 +4657,7 @@
                 <w:szCs w:val="28"/>
                 <w:rtl/>
               </w:rPr>
-              <w:t xml:space="preserve">التفاسير — وعمدتها المدارس الخمس المعتمدة في الفصل الرابع (ابن كثير، ابن عاشور، القرطبي، الرازي، سيد قطب)، ويُستأنس معها بالطبري والزحيلي — وكتب السيرة واللغة والعلوم الإسلامية: شارحة ومفسِّرة لا مُنشئة للأفكار.</w:t>
+              <w:t xml:space="preserve">كتب التفسير، وعمدتها المدارس الخمس المعتمدة في الفصل الرابع (ابن كثير، ابن عاشور، القرطبي، الرازي، سيد قطب)، ويُستأنس معها بالطبري والزحيلي؛ ثم كتب السيرة واللغة والعلوم الإسلامية. وكلها تشرح وتفسّر، ولا تُنشئ الأفكار.</w:t>
             </w:r>
           </w:p>
         </w:tc>
@@ -7661,7 +4704,7 @@
           <w:szCs w:val="28"/>
           <w:rtl/>
         </w:rPr>
-        <w:t>القاعدة التشغيلية: في كل بطاقة هوية معرفية — حقل "بيان السنة النبوية" لا يُثبت مفهومًا جديدًا، بل يُثبت كيف بيَّن النبي ﷺ وطبَّق المفهوم القرآني الذي أُسِّس أولًا من النص. المنطلق دائمًا القرآن، والسنة والسيرة شاهدان على ذلك.</w:t>
+        <w:t xml:space="preserve">والقاعدة العملية لذلك: حقل «بيان السنة النبوية» في كل بطاقة هوية معرفية لا يُنشئ مفهومًا جديدًا، وإنما يبيّن كيف شرح النبي ﷺ المفهوم القرآني وطبّقه بعد أن يكون قد تأسّس من النص. البداية دائمًا من القرآن، والسنة والسيرة شاهدتان.</w:t>
       </w:r>
     </w:p>
     <w:p>
@@ -7710,7 +4753,7 @@
           <w:szCs w:val="28"/>
           <w:rtl/>
         </w:rPr>
-        <w:t>1.5  مشكلة القولبة — لماذا الانطلاق من القرآن شرط لا تحسين</w:t>
+        <w:t xml:space="preserve">1.5  مشكلة القولبة: لماذا يكون الانطلاق من القرآن شرطًا</w:t>
       </w:r>
     </w:p>
     <w:p>
@@ -7731,7 +4774,7 @@
           <w:szCs w:val="28"/>
           <w:rtl/>
         </w:rPr>
-        <w:t>لا يمكن فهم هذا الكتاب دون فهم الظاهرة التي يسعى إلى تجاوزها. هذه الظاهرة ليست "التأثر بالغرب" بوصفه أمرًا مفهومًا ومتوقعًا — بل هي شيء أعمق: القولبة.</w:t>
+        <w:t xml:space="preserve">ولا يُفهم هذا الكتاب دون فهم الظاهرة التي يحاول تجاوزها. وهي ليست مجرد التأثر بالغرب، فذلك أمر طبيعي ومتوقع، وإنما شيء أعمق أسمّيه «القولبة».</w:t>
       </w:r>
     </w:p>
     <w:tbl>
@@ -7788,7 +4831,7 @@
                 <w:szCs w:val="28"/>
                 <w:rtl/>
               </w:rPr>
-              <w:t>القولبة — التعريف الإجرائي</w:t>
+              <w:t xml:space="preserve">القولبة: تعريف إجرائي</w:t>
             </w:r>
           </w:p>
         </w:tc>
@@ -7826,7 +4869,7 @@
                 <w:szCs w:val="28"/>
                 <w:rtl/>
               </w:rPr>
-              <w:t>أن تُشكَّل عقولُ الناس داخل إطار فكري واحد بحيث لا تستطيع التفكير خارجه — حتى حين تظن أنها تُعارضه. المُقولَب يرفض النموذج بلسانه ويُعيد إنتاجه بعقله.</w:t>
+              <w:t xml:space="preserve">أن يتشكّل العقل داخل إطار فكري واحد حتى يعجز عن التفكير خارجه، ولو ظنّ أنه يعارضه. فالمقولَب يرفض النموذج بلسانه ويعيد إنتاجه بعقله.</w:t>
             </w:r>
           </w:p>
         </w:tc>
@@ -7861,7 +4904,7 @@
           <w:szCs w:val="28"/>
           <w:rtl/>
         </w:rPr>
-        <w:t xml:space="preserve">أنتجت أكثر من مئة عام من الهيمنة الثقافية الغربية قولبةً واسعة النطاق في العالم الإسلامي. ومظاهرها ملموسة: "مصارف إسلامية" تعمل ببنية مصرفية غربية وتكتفي باستبدال المصطلحات الشرعية بالمصطلحات التقليدية، و"علم نفس إسلامي" يأخذ نظريات فرويد ويونغ ثم يبحث لها عن شواهد قرآنية. وفي بيئة العمل اليومية: نظام تقييم أداء مستورد كما هو، تُضاف إلى مقدمته آية عن الإتقان وحديث عن الأمانة، ثم يُقدَّم بوصفه "نظامًا إسلاميًا".</w:t>
+        <w:t xml:space="preserve">وقد أنتج أكثر من قرن من الهيمنة الثقافية الغربية قولبةً واسعة في العالم الإسلامي، ومظاهرها ليست خفية: "مصارف إسلامية" تعمل ببنية مصرفية غربية وتكتفي باستبدال المصطلحات الشرعية بالمصطلحات التقليدية، و"علم نفس إسلامي" يأخذ نظريات فرويد ويونغ ثم يبحث لها عن شواهد قرآنية. وفي بيئة العمل اليومية ترى نظام تقييم أداء مستوردًا كما هو، أُضيفت إلى مقدمته آية عن الإتقان وحديث عن الأمانة، ثم قُدّم بوصفه "نظامًا إسلاميًا".</w:t>
       </w:r>
     </w:p>
     <w:p>
@@ -7885,7 +4928,7 @@
           <w:szCs w:val="28"/>
           <w:rtl/>
         </w:rPr>
-        <w:t>Edward Said, Orientalism (1978): وثَّق كيف أن البنى المعرفية الغربية تُشكّل رؤية الآخر لنفسه. القولبة ليست استعمارًا عسكريًا — بل استعمار معرفي يُعيد إنتاج التبعية من الداخل.</w:t>
+        <w:t xml:space="preserve">Edward Said, Orientalism (1978): بيّن كيف تشكّل البنى المعرفية الغربية نظرةَ الآخر إلى نفسه. والقولبة بهذا المعنى استعمار معرفي لا عسكري، يعيد إنتاج التبعية من الداخل.</w:t>
       </w:r>
     </w:p>
     <w:p>
@@ -7920,7 +4963,7 @@
           <w:szCs w:val="28"/>
           <w:rtl/>
         </w:rPr>
-        <w:t>ثلاث مراحل للقولبة — وكيف يكسرها هذا الكتاب</w:t>
+        <w:t xml:space="preserve">ثلاث مراحل للقولبة، وكيف يحاول الكتاب كسرها</w:t>
       </w:r>
     </w:p>
     <w:tbl>
@@ -8123,7 +5166,7 @@
                 <w:szCs w:val="28"/>
                 <w:rtl/>
               </w:rPr>
-              <w:t>الغرب مرجعية مطلقة — ما أنتجه هو المعيار</w:t>
+              <w:t xml:space="preserve">الغرب مرجعية مطلقة، وما أنتجه هو المعيار</w:t>
             </w:r>
           </w:p>
         </w:tc>
@@ -8157,7 +5200,7 @@
                 <w:szCs w:val="28"/>
                 <w:rtl/>
               </w:rPr>
-              <w:t>مبدأ أقومية القرآن يُعيد تحديد المرجعية: القرآن هو الأقوم — والغرب أحد مصادر الخبرة الإنسانية</w:t>
+              <w:t xml:space="preserve">يعيد مبدأ أقومية القرآن تحديد المرجعية: القرآن هو الأقوم، والغرب أحد مصادر الخبرة الإنسانية</w:t>
             </w:r>
           </w:p>
         </w:tc>
@@ -8263,7 +5306,7 @@
                 <w:szCs w:val="28"/>
                 <w:rtl/>
               </w:rPr>
-              <w:t>الانطلاق من القرآن بسؤال مفتوح — ما الذي ينبثق من هنا؟ — لا من نموذج غربي والبحث عمّا يُؤيده</w:t>
+              <w:t xml:space="preserve">الانطلاق من القرآن بسؤال مفتوح عمّا ينبثق منه، لا من نموذج غربي نبحث له عن شواهد</w:t>
             </w:r>
           </w:p>
         </w:tc>
@@ -8369,7 +5412,7 @@
                 <w:szCs w:val="28"/>
                 <w:rtl/>
               </w:rPr>
-              <w:t>سلم الاشتقاق السباعي + البروتوكول الثماني + بطاقة الهوية = أدوات تُنتج المعرفة من القرآن</w:t>
+              <w:t xml:space="preserve">سلم الاشتقاق السباعي، وبروتوكول القراءة الثماني، وبطاقة الهوية المعرفية: أدوات لإنتاج المعرفة من القرآن</w:t>
             </w:r>
           </w:p>
         </w:tc>
@@ -8416,8 +5459,7 @@
           <w:szCs w:val="28"/>
           <w:rtl/>
         </w:rPr>
-        <w:lastRenderedPageBreak/>
-        <w:t>هذا المشروع ليس محاولةً لأسلمة الإدارة الغربية — بل محاولةٌ لبناء منظومة إدارية من الوحي، ثم السؤال عمَّن ينسجم معها لا عمَّا يُحاكيها.</w:t>
+        <w:t xml:space="preserve">فالمشروع لا يحاول أسلمة الإدارة الغربية، وإنما يحاول أن يبني منظومة إدارية من الوحي، ثم ينظر بعد ذلك: ما الذي ينسجم معها من خبرة البشر؟</w:t>
       </w:r>
     </w:p>
     <w:p>
@@ -8466,7 +5508,7 @@
           <w:szCs w:val="28"/>
           <w:rtl/>
         </w:rPr>
-        <w:t>1.6  اللحظة التاريخية — لماذا هذا المشروع ممكن الآن</w:t>
+        <w:t xml:space="preserve">1.6  اللحظة التاريخية: لماذا يبدو هذا المشروع ممكنًا الآن</w:t>
       </w:r>
     </w:p>
     <w:p>
@@ -8487,7 +5529,7 @@
           <w:szCs w:val="28"/>
           <w:rtl/>
         </w:rPr>
-        <w:t>منذ أكثر من مئة عام والعقل الإسلامي يعيش تحت ضغطَين: ضغط الانبهار بالنموذج الغربي الذي يجعل كل بديل يبدو تخلفًا، وضغط الاضطرار إلى الانسجام معه الذي يجعل كل معارضة تبدو انتحارًا أكاديميًا. اليوم بدأ هذان الضغطان في التراجع:</w:t>
+        <w:t xml:space="preserve">عاش العقل الإسلامي أكثر من قرن تحت ضغطين: انبهارٍ بالنموذج الغربي يجعل كل بديل يبدو تخلفًا، واضطرارٍ إلى الانسجام معه يجعل كل معارضة تبدو انتحارًا أكاديميًا. وأظن أن هذين الضغطين بدآ يتراجعان.</w:t>
       </w:r>
     </w:p>
     <w:p>
@@ -8511,7 +5553,7 @@
           <w:szCs w:val="28"/>
           <w:rtl/>
         </w:rPr>
-        <w:t>تراجع الضغط الأول — انكسار الانبهار</w:t>
+        <w:t xml:space="preserve">تراجع الضغط الأول: انكسار الانبهار</w:t>
       </w:r>
     </w:p>
     <w:p>
@@ -8532,7 +5574,7 @@
           <w:szCs w:val="28"/>
           <w:rtl/>
         </w:rPr>
-        <w:t>ما شهده العالم من أزمة ثقة في النموذج الليبرالي الغربي — يُوثّقها باحثون غربيون أنفسهم — كشف أن هذا النموذج إطارٌ تاريخي له حدوده وتناقضاته، لا مرجعيةً للقيم الكونية المطلقة. حتى في قلب المنظومة الغربية، النقد الداخلي يتصاعد (Ghoshal 2005, Streeck 2016, Mishra 2017). هذا لا يعني أن الغرب انهار — بل يعني أن هالة المطلق زالت.</w:t>
+        <w:t xml:space="preserve">فقد كشفت أزمة الثقة في النموذج الليبرالي الغربي، وهي أزمة يوثّقها باحثون غربيون أنفسهم (Ghoshal 2005؛ Streeck 2016؛ Mishra 2017)، أن هذا النموذج إطار تاريخي له حدوده وتناقضاته، وليس مرجعًا للقيم الكونية المطلقة. لا يعني هذا أن الغرب انهار، لكنه يعني أن هالة الإطلاق التي أحاطت به قد زالت.</w:t>
       </w:r>
     </w:p>
     <w:p>
@@ -8591,7 +5633,7 @@
           <w:szCs w:val="28"/>
           <w:rtl/>
         </w:rPr>
-        <w:t>تراجع الضغط الثاني — اتساع الفضاء الفكري</w:t>
+        <w:t xml:space="preserve">تراجع الضغط الثاني: اتساع الفضاء الفكري</w:t>
       </w:r>
     </w:p>
     <w:p>
@@ -8612,7 +5654,7 @@
           <w:szCs w:val="28"/>
           <w:rtl/>
         </w:rPr>
-        <w:t>تخلّي القوى الكبرى عن ادعاء الالتزام بالمنظومة الليبرالية أسقط ضغط الاضطرار للانسجام معها. هذا لا يُبرر أي نموذج بديل — لكنه يفتح الفضاء الفكري لمشاريع معرفية مستقلة.</w:t>
+        <w:t xml:space="preserve">ثم إن تخلّي القوى الكبرى عن ادعاء الالتزام بالمنظومة الليبرالية خفّف كثيرًا من الضغط على غيرها لتتبعها. وهذا لا يبرّر أي بديل كيفما اتفق، لكنه يفتح المجال لمشاريع معرفية مستقلة.</w:t>
       </w:r>
     </w:p>
     <w:p>
@@ -8636,7 +5678,7 @@
           <w:szCs w:val="28"/>
           <w:rtl/>
         </w:rPr>
-        <w:t>النتيجة: فضاء مفتوح — والسؤال: من يملؤه؟</w:t>
+        <w:t xml:space="preserve">والنتيجة فضاء مفتوح، والسؤال: من سيملؤه؟</w:t>
       </w:r>
     </w:p>
     <w:p>
@@ -8657,7 +5699,7 @@
           <w:szCs w:val="28"/>
           <w:rtl/>
         </w:rPr>
-        <w:t>هذه — بحسب ما يرى الباحث — من أنسب اللحظات في التاريخ المعاصر لإطلاق مشروع قرآني صارم. المشروع الذي لم يكن ليُسمَع بالجدية التي يستحقها قبل عقد — يمكنه اليوم أن يُسمَع. والسؤال ليس "هل الوقت مناسب؟" — بل "من سيملأ هذا الفراغ: مشاريع قرآنية صارمة أم فوضى فكرية؟"</w:t>
+        <w:t xml:space="preserve">لهذا أرى أن اللحظة الراهنة من أنسب اللحظات في تاريخنا المعاصر لإطلاق مشروع قرآني صارم. فما كان يصعب أن يُسمع بجدية قبل عقد يمكن أن يُسمع اليوم. والسؤال عندي لم يعد: هل الوقت مناسب؟ بل: من سيملأ هذا الفراغ، مشاريع قرآنية منضبطة أم فوضى فكرية؟</w:t>
       </w:r>
     </w:p>
     <w:p>
@@ -8706,7 +5748,7 @@
           <w:szCs w:val="28"/>
           <w:rtl/>
         </w:rPr>
-        <w:t>1.7  حدود الادعاء — ما يدّعيه هذا الفصل وما لا يدّعيه</w:t>
+        <w:t xml:space="preserve">1.7  حدود الادعاء: ما يدّعيه هذا الفصل وما لا يدّعيه</w:t>
       </w:r>
     </w:p>
     <w:p>
@@ -8727,8 +5769,7 @@
           <w:szCs w:val="28"/>
           <w:rtl/>
         </w:rPr>
-        <w:lastRenderedPageBreak/>
-        <w:t>الأمانة العلمية تقتضي أن يُختم كل فصل ببيان حدوده — ما أُثبت فيه وما لم يُثبت.</w:t>
+        <w:t xml:space="preserve">ومن الأمانة أن يُختم كل فصل ببيان ما أثبته وما لم يثبته.</w:t>
       </w:r>
     </w:p>
     <w:tbl>
@@ -8858,7 +5899,7 @@
                 <w:szCs w:val="28"/>
                 <w:rtl/>
               </w:rPr>
-              <w:t>هذا المشروع يعمل داخل إطار ابستيمولوجي إسلامي مُعلَن — والإعلان عنه أمانة علمية لا ضعف منهجي</w:t>
+              <w:t xml:space="preserve">يعمل المشروع داخل إطار معرفي إسلامي معلن، وإعلانه أمانة علمية لا ضعف منهجي</w:t>
             </w:r>
           </w:p>
         </w:tc>
@@ -8892,7 +5933,7 @@
                 <w:szCs w:val="28"/>
                 <w:rtl/>
               </w:rPr>
-              <w:t>لا يدَّعي أن هذا الإطار هو الوحيد المشروع — بل يُقرّ بمشروعية الأطر الأخرى ويُحدد موقعه منها</w:t>
+              <w:t xml:space="preserve">لا يدّعي أن هذا الإطار هو الوحيد المشروع، ويقرّ بمشروعية الأطر الأخرى ويحدد موقعه منها</w:t>
             </w:r>
           </w:p>
         </w:tc>
@@ -8928,7 +5969,7 @@
                 <w:szCs w:val="28"/>
                 <w:rtl/>
               </w:rPr>
-              <w:t>مبدأ أقومية القرآن بمعنييه هو المنطلق الجوهري الذي يُحدد كل ما يلي في هذا الكتاب</w:t>
+              <w:t xml:space="preserve">مبدأ أقومية القرآن بمعنييه هو المنطلق الذي يُبنى عليه ما بعده في الكتاب</w:t>
             </w:r>
           </w:p>
         </w:tc>
@@ -8962,7 +6003,7 @@
                 <w:szCs w:val="28"/>
                 <w:rtl/>
               </w:rPr>
-              <w:t>لا يدَّعي أن القولبة قصد بها أصحابُ مشاريع الأسلمة — بل يُقرّ بنياتهم الحسنة ويُشخّص الظاهرة بنيويًا</w:t>
+              <w:t xml:space="preserve">لا يدّعي أن أصحاب مشاريع الأسلمة قصدوا القولبة، ويقرّ بحسن نياتهم ويصف الظاهرة وصفًا بنيويًا</w:t>
             </w:r>
           </w:p>
         </w:tc>
@@ -8998,7 +6039,7 @@
                 <w:szCs w:val="28"/>
                 <w:rtl/>
               </w:rPr>
-              <w:t>القولبة ظاهرة بنيوية حقيقية أعاقت الإنتاج المعرفي الإسلامي الأصيل — والتحرر منها شرط لا تحسين</w:t>
+              <w:t xml:space="preserve">القولبة ظاهرة بنيوية أعاقت الإنتاج المعرفي الإسلامي الأصيل، والتحرر منها شرط لا تحسين</w:t>
             </w:r>
           </w:p>
         </w:tc>
@@ -9032,7 +6073,7 @@
                 <w:szCs w:val="28"/>
                 <w:rtl/>
               </w:rPr>
-              <w:t>لا يدَّعي أن كل ما أنتجه الغرب خاطئ — بل يُقرّ بأن الخبرة الإنسانية مشترك والأدوات الغربية من أجود ما أُنتج</w:t>
+              <w:t xml:space="preserve">لا يدّعي أن كل ما أنتجه الغرب خطأ؛ فالخبرة الإنسانية مشتركة، والأدوات الغربية من أجود ما أُنتج</w:t>
             </w:r>
           </w:p>
         </w:tc>
@@ -9068,7 +6109,7 @@
                 <w:szCs w:val="28"/>
                 <w:rtl/>
               </w:rPr>
-              <w:t>اللحظة الراهنة أنسب — بحسب تقدير الباحث — لإطلاق مشروع قرآني صارم</w:t>
+              <w:t xml:space="preserve">اللحظة الراهنة، في تقدير الباحث، مناسبة لإطلاق مشروع قرآني صارم</w:t>
             </w:r>
           </w:p>
         </w:tc>
@@ -9102,7 +6143,7 @@
                 <w:szCs w:val="28"/>
                 <w:rtl/>
               </w:rPr>
-              <w:t>لا يدَّعي أن النجاح مضمون — النجاح خاضع للفرضية الصفرية في الفصل الثالث</w:t>
+              <w:t xml:space="preserve">لا يدّعي أن النجاح مضمون؛ فالحكم للفرضية الصفرية في الفصل الثالث</w:t>
             </w:r>
           </w:p>
         </w:tc>
@@ -9138,7 +6179,7 @@
                 <w:szCs w:val="28"/>
                 <w:rtl/>
               </w:rPr>
-              <w:t xml:space="preserve">مثال المديرين الثلاثة في مطلع الفصل يُوضِّح موضع السؤال الذي ينطلق منه الكتاب</w:t>
+              <w:t xml:space="preserve">مثال المديرين الثلاثة يوضّح موضع السؤال الذي ينطلق منه الكتاب</w:t>
             </w:r>
           </w:p>
         </w:tc>
@@ -9172,7 +6213,7 @@
                 <w:szCs w:val="28"/>
                 <w:rtl/>
               </w:rPr>
-              <w:t xml:space="preserve">لا يدَّعي أن المثال دليلٌ على صحة المسار الثاني — فهو مثال افتراضي، والحكم للاشتقاق والاختبار في الفصول التالية</w:t>
+              <w:t xml:space="preserve">لا يدّعي أن المثال دليل على صحة المسار الثاني؛ فهو مثال افتراضي، والحكم للاشتقاق والاختبار في الفصول التالية</w:t>
             </w:r>
           </w:p>
         </w:tc>
@@ -9243,175 +6284,7 @@
                 <w:szCs w:val="28"/>
                 <w:rtl/>
               </w:rPr>
-              <w:t>🪞</w:t>
-            </w:r>
-            <w:r>
-              <w:rPr>
-                <w:rFonts w:ascii="Sakkal Majalla" w:hAnsi="Sakkal Majalla" w:cs="Sakkal Majalla"/>
-                <w:b/>
-                <w:bCs/>
-                <w:color w:val="FFFFFF"/>
-                <w:sz w:val="28"/>
-                <w:szCs w:val="28"/>
-                <w:rtl/>
-              </w:rPr>
-              <w:t xml:space="preserve">  </w:t>
-            </w:r>
-            <w:r>
-              <w:rPr>
-                <w:rFonts w:ascii="Sakkal Majalla" w:hAnsi="Sakkal Majalla" w:cs="Sakkal Majalla" w:hint="cs"/>
-                <w:b/>
-                <w:bCs/>
-                <w:color w:val="FFFFFF"/>
-                <w:sz w:val="28"/>
-                <w:szCs w:val="28"/>
-                <w:rtl/>
-              </w:rPr>
-              <w:t>مرآة</w:t>
-            </w:r>
-            <w:r>
-              <w:rPr>
-                <w:rFonts w:ascii="Sakkal Majalla" w:hAnsi="Sakkal Majalla" w:cs="Sakkal Majalla"/>
-                <w:b/>
-                <w:bCs/>
-                <w:color w:val="FFFFFF"/>
-                <w:sz w:val="28"/>
-                <w:szCs w:val="28"/>
-                <w:rtl/>
-              </w:rPr>
-              <w:t xml:space="preserve"> </w:t>
-            </w:r>
-            <w:r>
-              <w:rPr>
-                <w:rFonts w:ascii="Sakkal Majalla" w:hAnsi="Sakkal Majalla" w:cs="Sakkal Majalla" w:hint="cs"/>
-                <w:b/>
-                <w:bCs/>
-                <w:color w:val="FFFFFF"/>
-                <w:sz w:val="28"/>
-                <w:szCs w:val="28"/>
-                <w:rtl/>
-              </w:rPr>
-              <w:t>المدير</w:t>
-            </w:r>
-            <w:r>
-              <w:rPr>
-                <w:rFonts w:ascii="Sakkal Majalla" w:hAnsi="Sakkal Majalla" w:cs="Sakkal Majalla"/>
-                <w:b/>
-                <w:bCs/>
-                <w:color w:val="FFFFFF"/>
-                <w:sz w:val="28"/>
-                <w:szCs w:val="28"/>
-                <w:rtl/>
-              </w:rPr>
-              <w:t xml:space="preserve"> </w:t>
-            </w:r>
-            <w:r>
-              <w:rPr>
-                <w:rFonts w:ascii="Sakkal Majalla" w:hAnsi="Sakkal Majalla" w:cs="Sakkal Majalla" w:hint="cs"/>
-                <w:b/>
-                <w:bCs/>
-                <w:color w:val="FFFFFF"/>
-                <w:sz w:val="28"/>
-                <w:szCs w:val="28"/>
-                <w:rtl/>
-              </w:rPr>
-              <w:t>—</w:t>
-            </w:r>
-            <w:r>
-              <w:rPr>
-                <w:rFonts w:ascii="Sakkal Majalla" w:hAnsi="Sakkal Majalla" w:cs="Sakkal Majalla"/>
-                <w:b/>
-                <w:bCs/>
-                <w:color w:val="FFFFFF"/>
-                <w:sz w:val="28"/>
-                <w:szCs w:val="28"/>
-                <w:rtl/>
-              </w:rPr>
-              <w:t xml:space="preserve"> </w:t>
-            </w:r>
-            <w:r>
-              <w:rPr>
-                <w:rFonts w:ascii="Sakkal Majalla" w:hAnsi="Sakkal Majalla" w:cs="Sakkal Majalla" w:hint="cs"/>
-                <w:b/>
-                <w:bCs/>
-                <w:color w:val="FFFFFF"/>
-                <w:sz w:val="28"/>
-                <w:szCs w:val="28"/>
-                <w:rtl/>
-              </w:rPr>
-              <w:t>الفصل</w:t>
-            </w:r>
-            <w:r>
-              <w:rPr>
-                <w:rFonts w:ascii="Sakkal Majalla" w:hAnsi="Sakkal Majalla" w:cs="Sakkal Majalla"/>
-                <w:b/>
-                <w:bCs/>
-                <w:color w:val="FFFFFF"/>
-                <w:sz w:val="28"/>
-                <w:szCs w:val="28"/>
-                <w:rtl/>
-              </w:rPr>
-              <w:t xml:space="preserve"> </w:t>
-            </w:r>
-            <w:r>
-              <w:rPr>
-                <w:rFonts w:ascii="Sakkal Majalla" w:hAnsi="Sakkal Majalla" w:cs="Sakkal Majalla" w:hint="cs"/>
-                <w:b/>
-                <w:bCs/>
-                <w:color w:val="FFFFFF"/>
-                <w:sz w:val="28"/>
-                <w:szCs w:val="28"/>
-                <w:rtl/>
-              </w:rPr>
-              <w:t>الأول</w:t>
-            </w:r>
-            <w:r>
-              <w:rPr>
-                <w:rFonts w:ascii="Sakkal Majalla" w:hAnsi="Sakkal Majalla" w:cs="Sakkal Majalla"/>
-                <w:b/>
-                <w:bCs/>
-                <w:color w:val="FFFFFF"/>
-                <w:sz w:val="28"/>
-                <w:szCs w:val="28"/>
-                <w:rtl/>
-              </w:rPr>
-              <w:t xml:space="preserve">: </w:t>
-            </w:r>
-            <w:r>
-              <w:rPr>
-                <w:rFonts w:ascii="Sakkal Majalla" w:hAnsi="Sakkal Majalla" w:cs="Sakkal Majalla" w:hint="cs"/>
-                <w:b/>
-                <w:bCs/>
-                <w:color w:val="FFFFFF"/>
-                <w:sz w:val="28"/>
-                <w:szCs w:val="28"/>
-                <w:rtl/>
-              </w:rPr>
-              <w:t>نقطة</w:t>
-            </w:r>
-            <w:r>
-              <w:rPr>
-                <w:rFonts w:ascii="Sakkal Majalla" w:hAnsi="Sakkal Majalla" w:cs="Sakkal Majalla"/>
-                <w:b/>
-                <w:bCs/>
-                <w:color w:val="FFFFFF"/>
-                <w:sz w:val="28"/>
-                <w:szCs w:val="28"/>
-                <w:rtl/>
-              </w:rPr>
-              <w:t xml:space="preserve"> </w:t>
-            </w:r>
-            <w:r>
-              <w:rPr>
-                <w:rFonts w:ascii="Sakkal Majalla" w:hAnsi="Sakkal Majalla" w:cs="Sakkal Majalla" w:hint="cs"/>
-                <w:b/>
-                <w:bCs/>
-                <w:color w:val="FFFFFF"/>
-                <w:sz w:val="28"/>
-                <w:szCs w:val="28"/>
-                <w:rtl/>
-              </w:rPr>
-              <w:t>الانطلاق</w:t>
+              <w:t xml:space="preserve">مرآة المدير: نقطة الانطلاق</w:t>
             </w:r>
           </w:p>
         </w:tc>
@@ -9468,7 +6341,7 @@
                 <w:szCs w:val="28"/>
                 <w:rtl/>
               </w:rPr>
-              <w:t xml:space="preserve">اختر نظامًا أو سياسة قائمة في مؤسستك — نظام الحوافز، أو معايير الترقية، أو آلية اتخاذ القرار. واكتب في سطر واحد التصوُّر عن الإنسان الذي يفترضه هذا النظام: هل يراه باحثًا عن منفعته يحتاج إلى رقابة؟ أم شريكًا يحتاج إلى ثقة؟ أم شيئًا ثالثًا؟</w:t>
+              <w:t xml:space="preserve">اختر نظامًا أو سياسة قائمة في مؤسستك: نظام الحوافز، أو معايير الترقية، أو طريقة اتخاذ القرار. واكتب في سطر واحد التصوّر عن الإنسان الذي يفترضه هذا النظام. هل يراه باحثًا عن منفعته يحتاج إلى رقابة؟ أم شريكًا يحتاج إلى ثقة؟ أم شيئًا ثالثًا؟</w:t>
             </w:r>
           </w:p>
           <w:p>
@@ -9489,7 +6362,7 @@
                 <w:szCs w:val="28"/>
                 <w:rtl/>
               </w:rPr>
-              <w:t xml:space="preserve">ثم اسأل: من أين جاء هذا التصوُّر؟ وهل اخترتَه بوعي، أم ورثتَه مع النظام؟</w:t>
+              <w:t xml:space="preserve">ثم اسأل: من أين جاء هذا التصوّر؟ وهل اخترتَه بوعي، أم ورثتَه مع النظام؟</w:t>
             </w:r>
           </w:p>
           <w:p>
@@ -9510,7 +6383,7 @@
                 <w:szCs w:val="28"/>
                 <w:rtl/>
               </w:rPr>
-              <w:t xml:space="preserve">لا يطلب منك هذا الفصل أن تُغيِّر النظام الآن؛ يطلب فقط أن ترى المسلَّمة التي يقوم عليها.</w:t>
+              <w:t xml:space="preserve">لا يطلب منك هذا الفصل أن تغيّر النظام الآن؛ يكفي أن ترى المسلّمة التي يقوم عليها.</w:t>
             </w:r>
           </w:p>
         </w:tc>
@@ -9595,7 +6468,7 @@
                 <w:szCs w:val="28"/>
                 <w:rtl/>
               </w:rPr>
-              <w:t xml:space="preserve">خاتمة الفصل — والجسر إلى الفصل الثاني</w:t>
+              <w:t xml:space="preserve">خاتمة الفصل</w:t>
             </w:r>
           </w:p>
         </w:tc>
@@ -9633,7 +6506,7 @@
                 <w:szCs w:val="28"/>
                 <w:rtl/>
               </w:rPr>
-              <w:t xml:space="preserve">ينتهي هذا الفصل بسؤال لا بإجابة مكتملة: إذا أردنا أن نبني مفهومًا إداريًا من القرآن، فما الذي يمنعنا من إسقاط رغباتنا على النص؟ لا يكفي أن نُعلن الإخلاص، لأن الإخلاص لا يحمي الباحث من الانتقاء غير المقصود؛ ولا يكفي أن نُكثر المراجع، لأن كثرتها لا تعني وضوح مسار الاستدلال. نحتاج إلى منهج يُبيِّن نقطة البدء، ودرجة اليقين، ونوع الانتقال من المعنى إلى المفهوم، ثم يضع النموذج في موقف يتبيَّن فيه نجاحه أو فشله — وهذا ما تبنيه الفصول التالية. لكن قبل بناء المنهج، لا بد أن نعرف أين يقف هذا المشروع مما كُتب قبله، ولماذا لم تكفِ جهود من سبقوه رغم إخلاصهم. هذا ما يُجيب عنه الفصل الثاني.</w:t>
+              <w:t xml:space="preserve">ينتهي هذا الفصل بسؤال لا بجواب مكتمل: إذا أردنا أن نبني مفهومًا إداريًا من القرآن، فما الذي يمنعنا من إسقاط رغباتنا على النص؟ لا يكفي أن نعلن الإخلاص، فالإخلاص لا يحمي الباحث من الانتقاء غير المقصود. ولا يكفي أن نكثر المراجع، فكثرتها لا تعني وضوح طريق الاستدلال. نحتاج إلى منهج يبيّن نقطة البدء، ودرجة اليقين، ونوع الانتقال من المعنى إلى المفهوم، ثم يضع النموذج في موقف يتبيّن فيه نجاحه أو فشله. وهذا ما تبنيه الفصول التالية. لكن قبل ذلك ينبغي أن نعرف أين يقف هذا المشروع مما كُتب قبله، ولماذا لم تكفِ جهود من سبقوه رغم إخلاصهم. وهذا موضوع الفصل الثاني.</w:t>
             </w:r>
           </w:p>
         </w:tc>

</xml_diff>